<commit_message>
Sync nine cards with updated character document
</commit_message>
<xml_diff>
--- a/晶塔世界角色.docx
+++ b/晶塔世界角色.docx
@@ -5337,68 +5337,78 @@
           <w:rFonts w:hint="eastAsia"/>
           <w:b w:val="1"/>
           <w:bCs w:val="1"/>
+          <w:sz w:val="18"/>
+          <w:szCs w:val="22"/>
+        </w:rPr>
+        <w:t xml:space="preserve">c 初始 </w:t>
+      </w:r>
+      <w:r>
+        <w:rPr>
+          <w:rFonts w:hint="eastAsia"/>
+          <w:b w:val="1"/>
+          <w:bCs w:val="1"/>
+          <w:sz w:val="18"/>
+          <w:szCs w:val="22"/>
+        </w:rPr>
+        <w:t>攻击</w:t>
+      </w:r>
+    </w:p>
+    <w:p>
+      <w:pPr>
+        <w:keepNext w:val="0"/>
+        <w:keepLines w:val="0"/>
+        <w:pageBreakBefore w:val="0"/>
+        <w:widowControl w:val="0"/>
+        <w:kinsoku w:val="1"/>
+        <w:wordWrap w:val="1"/>
+        <w:overflowPunct w:val="1"/>
+        <w:topLinePunct w:val="0"/>
+        <w:autoSpaceDE w:val="1"/>
+        <w:autoSpaceDN w:val="1"/>
+        <w:bidi w:val="0"/>
+        <w:adjustRightInd w:val="1"/>
+        <w:snapToGrid w:val="1"/>
+        <w:spacing w:line="240" w:lineRule="exact"/>
+        <w:ind/>
+        <w:textAlignment w:val="auto"/>
+        <w:rPr>
+          <w:rFonts w:hint="eastAsia"/>
+          <w:b w:val="1"/>
+          <w:bCs w:val="1"/>
+          <w:sz w:val="18"/>
+          <w:szCs w:val="22"/>
+        </w:rPr>
+      </w:pPr>
+      <w:r>
+        <w:rPr>
+          <w:rFonts w:hint="eastAsia"/>
+          <w:b w:val="1"/>
+          <w:bCs w:val="1"/>
+          <w:sz w:val="18"/>
+          <w:szCs w:val="22"/>
+        </w:rPr>
+        <w:t>造成 1</w:t>
+      </w:r>
+      <w:r>
+        <w:rPr>
+          <w:rFonts w:hint="eastAsia"/>
+          <w:b w:val="1"/>
+          <w:bCs w:val="1"/>
+          <w:sz w:val="18"/>
+          <w:szCs w:val="22"/>
+        </w:rPr>
+        <w:t>1</w:t>
+      </w:r>
+      <w:r>
+        <w:rPr>
+          <w:rFonts w:hint="eastAsia"/>
+          <w:b w:val="1"/>
+          <w:bCs w:val="1"/>
           <w:color w:val="00B050"/>
           <w:sz w:val="18"/>
           <w:szCs w:val="22"/>
         </w:rPr>
-        <w:t>（0）</w:t>
-      </w:r>
-      <w:r>
-        <w:rPr>
-          <w:rFonts w:hint="eastAsia"/>
-          <w:b w:val="1"/>
-          <w:bCs w:val="1"/>
-          <w:sz w:val="18"/>
-          <w:szCs w:val="22"/>
-        </w:rPr>
-        <w:t xml:space="preserve">c  初始 </w:t>
-      </w:r>
-      <w:r>
-        <w:rPr>
-          <w:rFonts w:hint="eastAsia"/>
-          <w:b w:val="1"/>
-          <w:bCs w:val="1"/>
-          <w:sz w:val="18"/>
-          <w:szCs w:val="22"/>
-        </w:rPr>
-        <w:t>攻击</w:t>
-      </w:r>
-    </w:p>
-    <w:p>
-      <w:pPr>
-        <w:keepNext w:val="0"/>
-        <w:keepLines w:val="0"/>
-        <w:pageBreakBefore w:val="0"/>
-        <w:widowControl w:val="0"/>
-        <w:kinsoku w:val="1"/>
-        <w:wordWrap w:val="1"/>
-        <w:overflowPunct w:val="1"/>
-        <w:topLinePunct w:val="0"/>
-        <w:autoSpaceDE w:val="1"/>
-        <w:autoSpaceDN w:val="1"/>
-        <w:bidi w:val="0"/>
-        <w:adjustRightInd w:val="1"/>
-        <w:snapToGrid w:val="1"/>
-        <w:spacing w:line="240" w:lineRule="exact"/>
-        <w:ind/>
-        <w:textAlignment w:val="auto"/>
-        <w:rPr>
-          <w:rFonts w:hint="eastAsia"/>
-          <w:b w:val="1"/>
-          <w:bCs w:val="1"/>
-          <w:sz w:val="18"/>
-          <w:szCs w:val="22"/>
-        </w:rPr>
-      </w:pPr>
-      <w:r>
-        <w:rPr>
-          <w:rFonts w:hint="eastAsia"/>
-          <w:b w:val="1"/>
-          <w:bCs w:val="1"/>
-          <w:sz w:val="18"/>
-          <w:szCs w:val="22"/>
-        </w:rPr>
-        <w:t>造成 10</w:t>
+        <w:t>（1</w:t>
       </w:r>
       <w:r>
         <w:rPr>
@@ -5409,7 +5419,18 @@
           <w:sz w:val="18"/>
           <w:szCs w:val="22"/>
         </w:rPr>
-        <w:t>（14）</w:t>
+        <w:t>5</w:t>
+      </w:r>
+      <w:r>
+        <w:rPr>
+          <w:rFonts w:hint="eastAsia"/>
+          <w:b w:val="1"/>
+          <w:bCs w:val="1"/>
+          <w:color w:val="00B050"/>
+          <w:sz w:val="18"/>
+          <w:szCs w:val="22"/>
+        </w:rPr>
+        <w:t>）</w:t>
       </w:r>
       <w:r>
         <w:rPr>
@@ -6110,6 +6131,9 @@
         <w:keepLines w:val="0"/>
         <w:pageBreakBefore w:val="0"/>
         <w:widowControl w:val="0"/>
+        <w:pBdr>
+          <w:bottom/>
+        </w:pBdr>
         <w:kinsoku w:val="1"/>
         <w:wordWrap w:val="1"/>
         <w:overflowPunct w:val="1"/>
@@ -6123,13 +6147,11 @@
         <w:ind/>
         <w:textAlignment w:val="auto"/>
         <w:rPr>
-          <w:rFonts w:hint="default" w:eastAsiaTheme="minorEastAsia"/>
-          <w:b w:val="1"/>
-          <w:bCs w:val="1"/>
-          <w:color w:val="851321" w:themeColor="accent6" w:themeShade="80"/>
-          <w:sz w:val="18"/>
-          <w:szCs w:val="22"/>
-          <w:lang w:val="en-US" w:eastAsia="zh-CN"/>
+          <w:rFonts w:hint="eastAsia"/>
+          <w:b w:val="1"/>
+          <w:bCs w:val="1"/>
+          <w:sz w:val="18"/>
+          <w:szCs w:val="22"/>
         </w:rPr>
       </w:pPr>
       <w:r>
@@ -6161,43 +6183,7 @@
           <w:sz w:val="18"/>
           <w:szCs w:val="22"/>
         </w:rPr>
-        <w:t>。</w:t>
-      </w:r>
-    </w:p>
-    <w:p>
-      <w:pPr>
-        <w:keepNext w:val="0"/>
-        <w:keepLines w:val="0"/>
-        <w:pageBreakBefore w:val="0"/>
-        <w:widowControl w:val="0"/>
-        <w:kinsoku w:val="1"/>
-        <w:wordWrap w:val="1"/>
-        <w:overflowPunct w:val="1"/>
-        <w:topLinePunct w:val="0"/>
-        <w:autoSpaceDE w:val="1"/>
-        <w:autoSpaceDN w:val="1"/>
-        <w:bidi w:val="0"/>
-        <w:adjustRightInd w:val="1"/>
-        <w:snapToGrid w:val="1"/>
-        <w:spacing w:line="240" w:lineRule="exact"/>
-        <w:textAlignment w:val="auto"/>
-        <w:rPr>
-          <w:rFonts w:hint="eastAsia"/>
-          <w:b w:val="1"/>
-          <w:bCs w:val="1"/>
-          <w:sz w:val="18"/>
-          <w:szCs w:val="22"/>
-        </w:rPr>
-      </w:pPr>
-      <w:r>
-        <w:rPr>
-          <w:rFonts w:hint="eastAsia"/>
-          <w:b w:val="1"/>
-          <w:bCs w:val="1"/>
-          <w:sz w:val="18"/>
-          <w:szCs w:val="22"/>
-        </w:rPr>
-        <w:t>将1张本牌的复制加入手牌。</w:t>
+        <w:t>。将1张本牌的复制加入手牌。</w:t>
       </w:r>
     </w:p>
     <w:p>
@@ -7981,27 +7967,17 @@
           <w:sz w:val="18"/>
           <w:szCs w:val="22"/>
         </w:rPr>
-        <w:t>造成3</w:t>
-      </w:r>
-      <w:r>
-        <w:rPr>
-          <w:rFonts w:hint="eastAsia"/>
-          <w:b w:val="1"/>
-          <w:bCs w:val="1"/>
-          <w:sz w:val="18"/>
-          <w:szCs w:val="22"/>
-        </w:rPr>
-        <w:t>点伤害</w:t>
-      </w:r>
-      <w:r>
-        <w:rPr>
-          <w:rFonts w:hint="eastAsia"/>
-          <w:b w:val="1"/>
-          <w:bCs w:val="1"/>
-          <w:sz w:val="18"/>
-          <w:szCs w:val="22"/>
-        </w:rPr>
-        <w:t>3</w:t>
+        <w:t>造成</w:t>
+      </w:r>
+      <w:r>
+        <w:rPr>
+          <w:rFonts w:hint="eastAsia"/>
+          <w:b w:val="1"/>
+          <w:bCs w:val="1"/>
+          <w:sz w:val="18"/>
+          <w:szCs w:val="22"/>
+        </w:rPr>
+        <w:t>2点伤害3</w:t>
       </w:r>
       <w:r>
         <w:rPr>
@@ -8012,7 +7988,29 @@
           <w:sz w:val="18"/>
           <w:szCs w:val="22"/>
         </w:rPr>
-        <w:t>（4）</w:t>
+        <w:t>（</w:t>
+      </w:r>
+      <w:r>
+        <w:rPr>
+          <w:rFonts w:hint="eastAsia"/>
+          <w:b w:val="1"/>
+          <w:bCs w:val="1"/>
+          <w:color w:val="00B050"/>
+          <w:sz w:val="18"/>
+          <w:szCs w:val="22"/>
+        </w:rPr>
+        <w:t>4</w:t>
+      </w:r>
+      <w:r>
+        <w:rPr>
+          <w:rFonts w:hint="eastAsia"/>
+          <w:b w:val="1"/>
+          <w:bCs w:val="1"/>
+          <w:color w:val="00B050"/>
+          <w:sz w:val="18"/>
+          <w:szCs w:val="22"/>
+        </w:rPr>
+        <w:t>）</w:t>
       </w:r>
       <w:r>
         <w:rPr>
@@ -8080,50 +8078,7 @@
           <w:sz w:val="18"/>
           <w:szCs w:val="22"/>
         </w:rPr>
-        <w:t>：手牌中每有一张晶化多造成一次3</w:t>
-      </w:r>
-      <w:r>
-        <w:rPr>
-          <w:rFonts w:hint="eastAsia"/>
-          <w:b w:val="1"/>
-          <w:bCs w:val="1"/>
-          <w:color w:val="00B050"/>
-          <w:sz w:val="18"/>
-          <w:szCs w:val="22"/>
-        </w:rPr>
-        <w:t>（</w:t>
-      </w:r>
-      <w:r>
-        <w:rPr>
-          <w:rFonts w:hint="eastAsia"/>
-          <w:b w:val="1"/>
-          <w:bCs w:val="1"/>
-          <w:color w:val="00B050"/>
-          <w:sz w:val="18"/>
-          <w:szCs w:val="22"/>
-        </w:rPr>
-        <w:t>4</w:t>
-      </w:r>
-      <w:r>
-        <w:rPr>
-          <w:rFonts w:hint="eastAsia"/>
-          <w:b w:val="1"/>
-          <w:bCs w:val="1"/>
-          <w:color w:val="00B050"/>
-          <w:sz w:val="18"/>
-          <w:szCs w:val="22"/>
-        </w:rPr>
-        <w:t>）</w:t>
-      </w:r>
-      <w:r>
-        <w:rPr>
-          <w:rFonts w:hint="eastAsia"/>
-          <w:b w:val="1"/>
-          <w:bCs w:val="1"/>
-          <w:sz w:val="18"/>
-          <w:szCs w:val="22"/>
-        </w:rPr>
-        <w:t>点伤害。</w:t>
+        <w:t>：手牌中每有一张晶化多造成一次伤害。</w:t>
       </w:r>
     </w:p>
     <w:p>
@@ -8740,7 +8695,17 @@
           <w:sz w:val="18"/>
           <w:szCs w:val="22"/>
         </w:rPr>
-        <w:t>：失去一点能量。</w:t>
+        <w:t>：失去</w:t>
+      </w:r>
+      <w:r>
+        <w:rPr>
+          <w:rFonts w:hint="eastAsia"/>
+          <w:b w:val="1"/>
+          <w:bCs w:val="1"/>
+          <w:sz w:val="18"/>
+          <w:szCs w:val="22"/>
+        </w:rPr>
+        <w:t>1c。</w:t>
       </w:r>
     </w:p>
     <w:p>
@@ -10937,11 +10902,11 @@
           <w:rFonts w:hint="eastAsia"/>
           <w:b w:val="1"/>
           <w:bCs w:val="1"/>
-          <w:color w:val="FF0000"/>
-          <w:sz w:val="18"/>
-          <w:szCs w:val="22"/>
-        </w:rPr>
-        <w:t>*</w:t>
+          <w:color w:val="000000"/>
+          <w:sz w:val="18"/>
+          <w:szCs w:val="22"/>
+        </w:rPr>
+        <w:t>气溶胶</w:t>
         <w:br w:type="textWrapping"/>
       </w:r>
       <w:r>
@@ -11521,26 +11486,108 @@
         <w:keepLines w:val="0"/>
         <w:pageBreakBefore w:val="0"/>
         <w:widowControl w:val="0"/>
-        <w:kinsoku w:val="1"/>
-        <w:wordWrap w:val="1"/>
-        <w:overflowPunct w:val="1"/>
-        <w:topLinePunct w:val="0"/>
-        <w:autoSpaceDE w:val="1"/>
-        <w:autoSpaceDN w:val="1"/>
-        <w:bidi w:val="0"/>
-        <w:adjustRightInd w:val="1"/>
-        <w:snapToGrid w:val="1"/>
-        <w:spacing w:line="240" w:lineRule="exact"/>
-        <w:textAlignment w:val="auto"/>
-        <w:rPr>
-          <w:rFonts w:hint="eastAsia"/>
-          <w:b w:val="1"/>
-          <w:bCs w:val="1"/>
-          <w:sz w:val="18"/>
-          <w:szCs w:val="22"/>
-          <w:lang w:val="en-US" w:eastAsia="zh-CN"/>
-        </w:rPr>
-      </w:pPr>
+        <w:numPr/>
+        <w:kinsoku w:val="1"/>
+        <w:wordWrap w:val="1"/>
+        <w:overflowPunct w:val="1"/>
+        <w:topLinePunct w:val="0"/>
+        <w:autoSpaceDE w:val="1"/>
+        <w:autoSpaceDN w:val="1"/>
+        <w:bidi w:val="0"/>
+        <w:adjustRightInd w:val="1"/>
+        <w:snapToGrid w:val="1"/>
+        <w:spacing w:line="240" w:lineRule="exact"/>
+        <w:ind/>
+        <w:textAlignment w:val="auto"/>
+        <w:rPr>
+          <w:rFonts w:hint="eastAsia"/>
+          <w:b w:val="1"/>
+          <w:bCs w:val="1"/>
+          <w:sz w:val="18"/>
+          <w:szCs w:val="22"/>
+          <w:lang w:val="en-US" w:eastAsia="zh-CN"/>
+        </w:rPr>
+      </w:pPr>
+      <w:r>
+        <w:rPr>
+          <w:rFonts w:hint="eastAsia"/>
+          <w:b w:val="1"/>
+          <w:bCs w:val="1"/>
+          <w:sz w:val="18"/>
+          <w:szCs w:val="22"/>
+          <w:lang w:val="en-US" w:eastAsia="zh-CN"/>
+        </w:rPr>
+        <w:t>本回合，这名敌人每受到7</w:t>
+      </w:r>
+      <w:r>
+        <w:rPr>
+          <w:rFonts w:hint="eastAsia"/>
+          <w:b w:val="1"/>
+          <w:bCs w:val="1"/>
+          <w:color w:val="00B050"/>
+          <w:sz w:val="18"/>
+          <w:szCs w:val="22"/>
+          <w:lang w:val="en-US" w:eastAsia="zh-CN"/>
+        </w:rPr>
+        <w:t>（6）</w:t>
+      </w:r>
+      <w:r>
+        <w:rPr>
+          <w:rFonts w:hint="eastAsia"/>
+          <w:b w:val="1"/>
+          <w:bCs w:val="1"/>
+          <w:sz w:val="18"/>
+          <w:szCs w:val="22"/>
+          <w:lang w:val="en-US" w:eastAsia="zh-CN"/>
+        </w:rPr>
+        <w:t>点</w:t>
+      </w:r>
+      <w:r>
+        <w:rPr>
+          <w:rFonts w:hint="eastAsia"/>
+          <w:b w:val="1"/>
+          <w:bCs w:val="1"/>
+          <w:color w:val="EFC851"/>
+          <w:sz w:val="18"/>
+          <w:szCs w:val="22"/>
+          <w:lang w:val="en-US" w:eastAsia="zh-CN"/>
+        </w:rPr>
+        <w:t>攻击伤害</w:t>
+      </w:r>
+      <w:r>
+        <w:rPr>
+          <w:rFonts w:hint="eastAsia"/>
+          <w:b w:val="1"/>
+          <w:bCs w:val="1"/>
+          <w:sz w:val="18"/>
+          <w:szCs w:val="22"/>
+          <w:lang w:val="en-US" w:eastAsia="zh-CN"/>
+        </w:rPr>
+        <w:t>，获得2层</w:t>
+      </w:r>
+      <w:r>
+        <w:rPr>
+          <w:rFonts w:hint="eastAsia"/>
+          <w:b w:val="1"/>
+          <w:bCs w:val="1"/>
+          <w:color w:val="EFC851"/>
+          <w:sz w:val="18"/>
+          <w:szCs w:val="22"/>
+          <w:lang w:val="en-US" w:eastAsia="zh-CN"/>
+        </w:rPr>
+        <w:t>中毒</w:t>
+      </w:r>
+      <w:r>
+        <w:rPr>
+          <w:rFonts w:hint="eastAsia"/>
+          <w:b w:val="1"/>
+          <w:bCs w:val="1"/>
+          <w:sz w:val="18"/>
+          <w:szCs w:val="22"/>
+          <w:lang w:val="en-US" w:eastAsia="zh-CN"/>
+        </w:rPr>
+        <w:t>。</w:t>
+      </w:r>
       <w:r>
         <w:rPr>
           <w:rFonts w:hint="eastAsia"/>
@@ -11581,97 +11628,6 @@
           <w:lang w:val="en-US" w:eastAsia="zh-CN"/>
         </w:rPr>
       </w:pPr>
-      <w:r>
-        <w:rPr>
-          <w:rFonts w:hint="eastAsia"/>
-          <w:b w:val="1"/>
-          <w:bCs w:val="1"/>
-          <w:sz w:val="18"/>
-          <w:szCs w:val="22"/>
-          <w:lang w:val="en-US" w:eastAsia="zh-CN"/>
-        </w:rPr>
-        <w:t>本回合，这名敌人每受到7</w:t>
-      </w:r>
-      <w:r>
-        <w:rPr>
-          <w:rFonts w:hint="eastAsia"/>
-          <w:b w:val="1"/>
-          <w:bCs w:val="1"/>
-          <w:color w:val="00B050"/>
-          <w:sz w:val="18"/>
-          <w:szCs w:val="22"/>
-          <w:lang w:val="en-US" w:eastAsia="zh-CN"/>
-        </w:rPr>
-        <w:t>（6）</w:t>
-      </w:r>
-      <w:r>
-        <w:rPr>
-          <w:rFonts w:hint="eastAsia"/>
-          <w:b w:val="1"/>
-          <w:bCs w:val="1"/>
-          <w:sz w:val="18"/>
-          <w:szCs w:val="22"/>
-          <w:lang w:val="en-US" w:eastAsia="zh-CN"/>
-        </w:rPr>
-        <w:t>点</w:t>
-      </w:r>
-      <w:r>
-        <w:rPr>
-          <w:rFonts w:hint="eastAsia"/>
-          <w:b w:val="1"/>
-          <w:bCs w:val="1"/>
-          <w:color w:val="EFC851"/>
-          <w:sz w:val="18"/>
-          <w:szCs w:val="22"/>
-          <w:lang w:val="en-US" w:eastAsia="zh-CN"/>
-        </w:rPr>
-        <w:t>攻击伤害</w:t>
-      </w:r>
-      <w:r>
-        <w:rPr>
-          <w:rFonts w:hint="eastAsia"/>
-          <w:b w:val="1"/>
-          <w:bCs w:val="1"/>
-          <w:sz w:val="18"/>
-          <w:szCs w:val="22"/>
-          <w:lang w:val="en-US" w:eastAsia="zh-CN"/>
-        </w:rPr>
-        <w:t>，获得2层</w:t>
-      </w:r>
-      <w:r>
-        <w:rPr>
-          <w:rFonts w:hint="eastAsia"/>
-          <w:b w:val="1"/>
-          <w:bCs w:val="1"/>
-          <w:color w:val="EFC851"/>
-          <w:sz w:val="18"/>
-          <w:szCs w:val="22"/>
-          <w:lang w:val="en-US" w:eastAsia="zh-CN"/>
-        </w:rPr>
-        <w:t>中毒</w:t>
-      </w:r>
-      <w:r>
-        <w:rPr>
-          <w:rFonts w:hint="eastAsia"/>
-          <w:b w:val="1"/>
-          <w:bCs w:val="1"/>
-          <w:sz w:val="18"/>
-          <w:szCs w:val="22"/>
-          <w:lang w:val="en-US" w:eastAsia="zh-CN"/>
-        </w:rPr>
-        <w:t>。</w:t>
-      </w:r>
-      <w:r>
-        <w:rPr>
-          <w:rFonts w:hint="eastAsia"/>
-          <w:b w:val="1"/>
-          <w:bCs w:val="1"/>
-          <w:sz w:val="18"/>
-          <w:szCs w:val="22"/>
-          <w:lang w:val="en-US" w:eastAsia="zh-CN"/>
-        </w:rPr>
-        <w:br w:type="textWrapping"/>
-      </w:r>
       <w:r>
         <w:rPr>
           <w:rFonts w:hint="eastAsia"/>
@@ -14876,7 +14832,30 @@
           <w:szCs w:val="22"/>
           <w:lang w:val="en-US" w:eastAsia="zh-CN"/>
         </w:rPr>
-        <w:t xml:space="preserve">-3 </w:t>
+        <w:t>-3</w:t>
+      </w:r>
+      <w:r>
+        <w:rPr>
+          <w:rFonts w:hint="eastAsia"/>
+          <w:b w:val="1"/>
+          <w:bCs w:val="1"/>
+          <w:sz w:val="18"/>
+          <w:szCs w:val="22"/>
+          <w:lang w:val="en-US" w:eastAsia="zh-CN"/>
+        </w:rPr>
+        <w:br w:type="textWrapping"/>
+        <w:t>给予的金币变为0时，将此卡从牌组中移除。</w:t>
+      </w:r>
+      <w:r>
+        <w:rPr>
+          <w:rFonts w:hint="eastAsia"/>
+          <w:b w:val="1"/>
+          <w:bCs w:val="1"/>
+          <w:sz w:val="18"/>
+          <w:szCs w:val="22"/>
+          <w:lang w:val="en-US" w:eastAsia="zh-CN"/>
+        </w:rPr>
+        <w:t xml:space="preserve"> </w:t>
       </w:r>
     </w:p>
     <w:p>
@@ -14926,11 +14905,12 @@
           <w:rFonts w:hint="eastAsia"/>
           <w:b w:val="1"/>
           <w:bCs w:val="1"/>
-          <w:sz w:val="18"/>
-          <w:szCs w:val="22"/>
-          <w:lang w:eastAsia="zh-CN"/>
-        </w:rPr>
-        <w:t>。</w:t>
+          <w:color w:val="EFC851"/>
+          <w:sz w:val="18"/>
+          <w:szCs w:val="22"/>
+          <w:lang w:val="en-US" w:eastAsia="zh-CN"/>
+        </w:rPr>
+        <w:t>，消耗</w:t>
       </w:r>
     </w:p>
     <w:p>
@@ -15609,6 +15589,7 @@
         <w:keepLines w:val="0"/>
         <w:pageBreakBefore w:val="0"/>
         <w:widowControl w:val="0"/>
+        <w:numPr/>
         <w:pBdr/>
         <w:kinsoku w:val="1"/>
         <w:wordWrap w:val="1"/>
@@ -15632,18 +15613,6 @@
           <w:u w:val="none"/>
         </w:rPr>
       </w:pPr>
-      <w:r>
-        <w:rPr>
-          <w:rFonts w:hint="eastAsia"/>
-          <w:b w:val="1"/>
-          <w:i w:val="0"/>
-          <w:strike w:val="0"/>
-          <w:spacing w:val="0"/>
-          <w:sz w:val="18"/>
-          <w:u w:val="none"/>
-        </w:rPr>
-        <w:t>本回合每当你抽牌时，下回合开始时抽等量牌。</w:t>
-      </w:r>
       <w:r>
         <w:rPr>
           <w:rFonts w:hint="eastAsia"/>
@@ -15704,6 +15673,48 @@
         <w:rPr>
           <w:rFonts w:hint="eastAsia"/>
           <w:b w:val="1"/>
+          <w:i w:val="0"/>
+          <w:strike w:val="0"/>
+          <w:spacing w:val="0"/>
+          <w:sz w:val="18"/>
+          <w:u w:val="none"/>
+        </w:rPr>
+      </w:pPr>
+      <w:r>
+        <w:rPr>
+          <w:rFonts w:hint="eastAsia"/>
+          <w:b w:val="1"/>
+          <w:i w:val="0"/>
+          <w:strike w:val="0"/>
+          <w:spacing w:val="0"/>
+          <w:sz w:val="18"/>
+          <w:u w:val="none"/>
+        </w:rPr>
+        <w:t>本回合每当你抽牌时，下回合开始时抽等量牌。</w:t>
+      </w:r>
+    </w:p>
+    <w:p>
+      <w:pPr>
+        <w:keepNext w:val="0"/>
+        <w:keepLines w:val="0"/>
+        <w:pageBreakBefore w:val="0"/>
+        <w:widowControl w:val="0"/>
+        <w:pBdr/>
+        <w:kinsoku w:val="1"/>
+        <w:wordWrap w:val="1"/>
+        <w:overflowPunct w:val="1"/>
+        <w:topLinePunct w:val="0"/>
+        <w:autoSpaceDE w:val="1"/>
+        <w:autoSpaceDN w:val="1"/>
+        <w:bidi w:val="0"/>
+        <w:adjustRightInd w:val="1"/>
+        <w:snapToGrid w:val="1"/>
+        <w:spacing w:line="240" w:lineRule="exact"/>
+        <w:ind/>
+        <w:textAlignment w:val="auto"/>
+        <w:rPr>
+          <w:rFonts w:hint="eastAsia"/>
+          <w:b w:val="1"/>
           <w:bCs w:val="1"/>
           <w:i w:val="0"/>
           <w:strike w:val="0"/>
@@ -16173,7 +16184,70 @@
           <w:sz w:val="18"/>
           <w:u w:val="none"/>
         </w:rPr>
-        <w:t>获得12（15）点</w:t>
+        <w:t>获得1</w:t>
+      </w:r>
+      <w:r>
+        <w:rPr>
+          <w:rFonts w:hint="eastAsia"/>
+          <w:b w:val="1"/>
+          <w:i w:val="0"/>
+          <w:strike w:val="0"/>
+          <w:spacing w:val="0"/>
+          <w:sz w:val="18"/>
+          <w:u w:val="none"/>
+        </w:rPr>
+        <w:t>2</w:t>
+      </w:r>
+      <w:r>
+        <w:rPr>
+          <w:rFonts w:hint="eastAsia"/>
+          <w:b w:val="1"/>
+          <w:i w:val="0"/>
+          <w:strike w:val="0"/>
+          <w:color w:val="00B050"/>
+          <w:spacing w:val="0"/>
+          <w:sz w:val="18"/>
+          <w:u w:val="none"/>
+        </w:rPr>
+        <w:t>（1</w:t>
+      </w:r>
+      <w:r>
+        <w:rPr>
+          <w:rFonts w:hint="eastAsia"/>
+          <w:b w:val="1"/>
+          <w:i w:val="0"/>
+          <w:strike w:val="0"/>
+          <w:color w:val="00B050"/>
+          <w:spacing w:val="0"/>
+          <w:sz w:val="18"/>
+          <w:u w:val="none"/>
+        </w:rPr>
+        <w:t>5</w:t>
+      </w:r>
+      <w:r>
+        <w:rPr>
+          <w:rFonts w:hint="eastAsia"/>
+          <w:b w:val="1"/>
+          <w:i w:val="0"/>
+          <w:strike w:val="0"/>
+          <w:color w:val="00B050"/>
+          <w:spacing w:val="0"/>
+          <w:sz w:val="18"/>
+          <w:u w:val="none"/>
+        </w:rPr>
+        <w:t>）</w:t>
+      </w:r>
+      <w:r>
+        <w:rPr>
+          <w:rFonts w:hint="eastAsia"/>
+          <w:b w:val="1"/>
+          <w:i w:val="0"/>
+          <w:strike w:val="0"/>
+          <w:spacing w:val="0"/>
+          <w:sz w:val="18"/>
+          <w:u w:val="none"/>
+        </w:rPr>
+        <w:t>点</w:t>
       </w:r>
       <w:r>
         <w:rPr>
@@ -16252,7 +16326,19 @@
           <w:sz w:val="18"/>
           <w:u w:val="none"/>
         </w:rPr>
-        <w:t>：你每有一张晶化获得4</w:t>
+        <w:t>：你每有一张晶化获得</w:t>
+      </w:r>
+      <w:r>
+        <w:rPr>
+          <w:rFonts w:hint="eastAsia"/>
+          <w:b w:val="1"/>
+          <w:i w:val="0"/>
+          <w:strike w:val="0"/>
+          <w:spacing w:val="0"/>
+          <w:sz w:val="18"/>
+          <w:u w:val="none"/>
+        </w:rPr>
+        <w:t>3</w:t>
       </w:r>
       <w:r>
         <w:rPr>
@@ -16265,7 +16351,33 @@
           <w:sz w:val="18"/>
           <w:u w:val="none"/>
         </w:rPr>
-        <w:t>（6）</w:t>
+        <w:t>（</w:t>
+      </w:r>
+      <w:r>
+        <w:rPr>
+          <w:rFonts w:hint="eastAsia"/>
+          <w:b w:val="1"/>
+          <w:i w:val="0"/>
+          <w:strike w:val="0"/>
+          <w:color w:val="00B050"/>
+          <w:spacing w:val="0"/>
+          <w:sz w:val="18"/>
+          <w:u w:val="none"/>
+        </w:rPr>
+        <w:t>5</w:t>
+      </w:r>
+      <w:r>
+        <w:rPr>
+          <w:rFonts w:hint="eastAsia"/>
+          <w:b w:val="1"/>
+          <w:i w:val="0"/>
+          <w:strike w:val="0"/>
+          <w:color w:val="00B050"/>
+          <w:spacing w:val="0"/>
+          <w:sz w:val="18"/>
+          <w:u w:val="none"/>
+        </w:rPr>
+        <w:t>）</w:t>
       </w:r>
       <w:r>
         <w:rPr>
@@ -16356,7 +16468,19 @@
           <w:sz w:val="18"/>
           <w:u w:val="none"/>
         </w:rPr>
-        <w:t>：你每有一层延拓获得6</w:t>
+        <w:t>：你每有一层延拓获得</w:t>
+      </w:r>
+      <w:r>
+        <w:rPr>
+          <w:rFonts w:hint="eastAsia"/>
+          <w:b w:val="1"/>
+          <w:i w:val="0"/>
+          <w:strike w:val="0"/>
+          <w:spacing w:val="0"/>
+          <w:sz w:val="18"/>
+          <w:u w:val="none"/>
+        </w:rPr>
+        <w:t>5</w:t>
       </w:r>
       <w:r>
         <w:rPr>
@@ -16369,7 +16493,33 @@
           <w:sz w:val="18"/>
           <w:u w:val="none"/>
         </w:rPr>
-        <w:t>（8）</w:t>
+        <w:t>（</w:t>
+      </w:r>
+      <w:r>
+        <w:rPr>
+          <w:rFonts w:hint="eastAsia"/>
+          <w:b w:val="1"/>
+          <w:i w:val="0"/>
+          <w:strike w:val="0"/>
+          <w:color w:val="00B050"/>
+          <w:spacing w:val="0"/>
+          <w:sz w:val="18"/>
+          <w:u w:val="none"/>
+        </w:rPr>
+        <w:t>7</w:t>
+      </w:r>
+      <w:r>
+        <w:rPr>
+          <w:rFonts w:hint="eastAsia"/>
+          <w:b w:val="1"/>
+          <w:i w:val="0"/>
+          <w:strike w:val="0"/>
+          <w:color w:val="00B050"/>
+          <w:spacing w:val="0"/>
+          <w:sz w:val="18"/>
+          <w:u w:val="none"/>
+        </w:rPr>
+        <w:t>）</w:t>
       </w:r>
       <w:r>
         <w:rPr>
@@ -16905,7 +17055,31 @@
           <w:szCs w:val="22"/>
           <w:lang w:val="en-US" w:eastAsia="zh-CN"/>
         </w:rPr>
-        <w:t>获得4层</w:t>
+        <w:t>获得</w:t>
+      </w:r>
+      <w:r>
+        <w:rPr>
+          <w:rFonts w:hint="eastAsia"/>
+          <w:b w:val="1"/>
+          <w:bCs w:val="1"/>
+          <w:color w:val="000000"/>
+          <w:sz w:val="18"/>
+          <w:szCs w:val="22"/>
+          <w:lang w:val="en-US" w:eastAsia="zh-CN"/>
+        </w:rPr>
+        <w:t>3</w:t>
+      </w:r>
+      <w:r>
+        <w:rPr>
+          <w:rFonts w:hint="eastAsia"/>
+          <w:b w:val="1"/>
+          <w:bCs w:val="1"/>
+          <w:color w:val="000000"/>
+          <w:sz w:val="18"/>
+          <w:szCs w:val="22"/>
+          <w:lang w:val="en-US" w:eastAsia="zh-CN"/>
+        </w:rPr>
+        <w:t>层</w:t>
       </w:r>
       <w:r>
         <w:rPr>
@@ -18964,6 +19138,156 @@
         </w:rPr>
         <w:t>不论何处，将1张“运用-中子+”放回你的手牌，使其获得消耗。</w:t>
       </w:r>
+      <w:r>
+        <w:rPr>
+          <w:rFonts w:hint="eastAsia"/>
+          <w:b w:val="1"/>
+          <w:bCs w:val="1"/>
+          <w:color w:val="auto"/>
+          <w:sz w:val="18"/>
+          <w:szCs w:val="22"/>
+          <w:lang w:val="en-US" w:eastAsia="zh-CN"/>
+        </w:rPr>
+        <w:br w:type="textWrapping"/>
+      </w:r>
+      <w:r>
+        <w:rPr>
+          <w:rFonts w:hint="eastAsia"/>
+          <w:b w:val="1"/>
+          <w:bCs w:val="1"/>
+          <w:color w:val="auto"/>
+          <w:sz w:val="18"/>
+          <w:szCs w:val="22"/>
+          <w:lang w:val="en-US" w:eastAsia="zh-CN"/>
+        </w:rPr>
+        <w:br w:type="textWrapping"/>
+      </w:r>
+      <w:r>
+        <w:rPr>
+          <w:rFonts w:hint="eastAsia"/>
+          <w:b w:val="1"/>
+          <w:bCs w:val="1"/>
+          <w:color w:val="auto"/>
+          <w:sz w:val="18"/>
+          <w:szCs w:val="22"/>
+          <w:lang w:val="en-US" w:eastAsia="zh-CN"/>
+        </w:rPr>
+        <w:t>运用-中子</w:t>
+      </w:r>
+      <w:r>
+        <w:rPr>
+          <w:rFonts w:hint="eastAsia"/>
+          <w:b w:val="1"/>
+          <w:bCs w:val="1"/>
+          <w:color w:val="auto"/>
+          <w:sz w:val="18"/>
+          <w:szCs w:val="22"/>
+          <w:lang w:val="en-US" w:eastAsia="zh-CN"/>
+        </w:rPr>
+        <w:br w:type="textWrapping"/>
+      </w:r>
+      <w:r>
+        <w:rPr>
+          <w:rFonts w:hint="eastAsia"/>
+          <w:b w:val="1"/>
+          <w:bCs w:val="1"/>
+          <w:color w:val="auto"/>
+          <w:sz w:val="18"/>
+          <w:szCs w:val="22"/>
+          <w:lang w:val="en-US" w:eastAsia="zh-CN"/>
+        </w:rPr>
+        <w:t>1（0）c 衍生 技能</w:t>
+      </w:r>
+    </w:p>
+    <w:p>
+      <w:pPr>
+        <w:keepNext w:val="0"/>
+        <w:keepLines w:val="0"/>
+        <w:pageBreakBefore w:val="0"/>
+        <w:widowControl w:val="0"/>
+        <w:pBdr/>
+        <w:kinsoku w:val="1"/>
+        <w:wordWrap w:val="1"/>
+        <w:overflowPunct w:val="1"/>
+        <w:topLinePunct w:val="0"/>
+        <w:autoSpaceDE w:val="1"/>
+        <w:autoSpaceDN w:val="1"/>
+        <w:bidi w:val="0"/>
+        <w:adjustRightInd w:val="1"/>
+        <w:snapToGrid w:val="1"/>
+        <w:spacing w:line="240" w:lineRule="exact"/>
+        <w:ind/>
+        <w:textAlignment w:val="auto"/>
+        <w:rPr>
+          <w:rFonts w:hint="eastAsia"/>
+          <w:b w:val="1"/>
+          <w:bCs w:val="1"/>
+          <w:color w:val="auto"/>
+          <w:sz w:val="18"/>
+          <w:szCs w:val="22"/>
+          <w:lang w:val="en-US" w:eastAsia="zh-CN"/>
+        </w:rPr>
+      </w:pPr>
+      <w:r>
+        <w:rPr>
+          <w:rFonts w:hint="eastAsia"/>
+          <w:b w:val="1"/>
+          <w:bCs w:val="1"/>
+          <w:color w:val="auto"/>
+          <w:sz w:val="18"/>
+          <w:szCs w:val="22"/>
+          <w:lang w:val="en-US" w:eastAsia="zh-CN"/>
+        </w:rPr>
+        <w:t>随机打出1张弃牌堆中花费不大于1的牌。</w:t>
+      </w:r>
+      <w:r>
+        <w:rPr>
+          <w:rFonts w:hint="eastAsia"/>
+          <w:b w:val="1"/>
+          <w:bCs w:val="1"/>
+          <w:color w:val="auto"/>
+          <w:sz w:val="18"/>
+          <w:szCs w:val="22"/>
+          <w:lang w:val="en-US" w:eastAsia="zh-CN"/>
+        </w:rPr>
+        <w:br w:type="textWrapping"/>
+      </w:r>
+      <w:r>
+        <w:rPr>
+          <w:rFonts w:hint="eastAsia"/>
+          <w:b w:val="1"/>
+          <w:bCs w:val="1"/>
+          <w:color w:val="auto"/>
+          <w:sz w:val="18"/>
+          <w:szCs w:val="22"/>
+          <w:lang w:val="en-US" w:eastAsia="zh-CN"/>
+        </w:rPr>
+        <w:t>晶抗：抽1张牌。</w:t>
+      </w:r>
+      <w:r>
+        <w:rPr>
+          <w:rFonts w:hint="eastAsia"/>
+          <w:b w:val="1"/>
+          <w:bCs w:val="1"/>
+          <w:color w:val="auto"/>
+          <w:sz w:val="18"/>
+          <w:szCs w:val="22"/>
+          <w:lang w:val="en-US" w:eastAsia="zh-CN"/>
+        </w:rPr>
+        <w:br w:type="textWrapping"/>
+      </w:r>
+      <w:r>
+        <w:rPr>
+          <w:rFonts w:hint="eastAsia"/>
+          <w:b w:val="1"/>
+          <w:bCs w:val="1"/>
+          <w:color w:val="auto"/>
+          <w:sz w:val="18"/>
+          <w:szCs w:val="22"/>
+          <w:lang w:val="en-US" w:eastAsia="zh-CN"/>
+        </w:rPr>
+        <w:t>晶逆：弃1张牌。</w:t>
+      </w:r>
     </w:p>
     <w:p>
       <w:pPr>
@@ -19246,48 +19570,6 @@
         <w:ind/>
         <w:textAlignment w:val="auto"/>
         <w:rPr>
-          <w:rFonts w:hint="eastAsia"/>
-          <w:b w:val="1"/>
-          <w:bCs w:val="1"/>
-          <w:color w:val="EFC851"/>
-          <w:sz w:val="18"/>
-          <w:szCs w:val="22"/>
-          <w:lang w:val="en-US" w:eastAsia="zh-CN"/>
-        </w:rPr>
-      </w:pPr>
-      <w:r>
-        <w:rPr>
-          <w:rFonts w:hint="eastAsia"/>
-          <w:b w:val="1"/>
-          <w:bCs w:val="1"/>
-          <w:color w:val="EFC851"/>
-          <w:sz w:val="18"/>
-          <w:szCs w:val="22"/>
-          <w:lang w:val="en-US" w:eastAsia="zh-CN"/>
-        </w:rPr>
-        <w:t>消耗</w:t>
-      </w:r>
-    </w:p>
-    <w:p>
-      <w:pPr>
-        <w:keepNext w:val="0"/>
-        <w:keepLines w:val="0"/>
-        <w:pageBreakBefore w:val="0"/>
-        <w:widowControl w:val="0"/>
-        <w:pBdr/>
-        <w:kinsoku w:val="1"/>
-        <w:wordWrap w:val="1"/>
-        <w:overflowPunct w:val="1"/>
-        <w:topLinePunct w:val="0"/>
-        <w:autoSpaceDE w:val="1"/>
-        <w:autoSpaceDN w:val="1"/>
-        <w:bidi w:val="0"/>
-        <w:adjustRightInd w:val="1"/>
-        <w:snapToGrid w:val="1"/>
-        <w:spacing w:line="240" w:lineRule="exact"/>
-        <w:ind/>
-        <w:textAlignment w:val="auto"/>
-        <w:rPr>
           <w:b w:val="1"/>
           <w:i w:val="0"/>
           <w:strike w:val="0"/>
@@ -19307,6 +19589,31 @@
           <w:u w:val="none"/>
         </w:rPr>
         <w:t>结束当前回合，获得一个额外回合。额外回合内，你至多打出x（x+1）张牌。</w:t>
+      </w:r>
+      <w:r>
+        <w:rPr>
+          <w:rFonts w:hint="eastAsia"/>
+          <w:b w:val="1"/>
+          <w:i w:val="0"/>
+          <w:strike w:val="0"/>
+          <w:color w:val="FFC000"/>
+          <w:spacing w:val="0"/>
+          <w:sz w:val="18"/>
+          <w:u w:val="none"/>
+        </w:rPr>
+        <w:t>消耗</w:t>
+      </w:r>
+      <w:r>
+        <w:rPr>
+          <w:rFonts w:hint="eastAsia"/>
+          <w:b w:val="1"/>
+          <w:i w:val="0"/>
+          <w:strike w:val="0"/>
+          <w:spacing w:val="0"/>
+          <w:sz w:val="18"/>
+          <w:u w:val="none"/>
+        </w:rPr>
+        <w:t>。</w:t>
       </w:r>
     </w:p>
     <w:p>
@@ -19447,7 +19754,6 @@
       </w:r>
       <w:r>
         <w:rPr>
-          <w:rFonts w:hint="eastAsia"/>
           <w:b w:val="1"/>
           <w:i w:val="0"/>
           <w:strike w:val="0"/>
@@ -19455,7 +19761,20 @@
           <w:sz w:val="18"/>
           <w:u w:val="none"/>
         </w:rPr>
-        <w:t>X。下回合开始时，抽</w:t>
+        <w:t>X</w:t>
+      </w:r>
+      <w:r>
+        <w:rPr>
+          <w:rFonts w:hint="eastAsia"/>
+          <w:b w:val="1"/>
+          <w:i w:val="0"/>
+          <w:strike w:val="0"/>
+          <w:color w:val="00B050"/>
+          <w:spacing w:val="0"/>
+          <w:sz w:val="18"/>
+          <w:u w:val="none"/>
+        </w:rPr>
+        <w:t>（X+1）</w:t>
       </w:r>
       <w:r>
         <w:rPr>
@@ -19467,7 +19786,7 @@
           <w:sz w:val="18"/>
           <w:u w:val="none"/>
         </w:rPr>
-        <w:t>X</w:t>
+        <w:t>。下回合开始时，抽</w:t>
       </w:r>
       <w:r>
         <w:rPr>
@@ -19479,19 +19798,7 @@
           <w:sz w:val="18"/>
           <w:u w:val="none"/>
         </w:rPr>
-        <w:t>(X+1）张牌。下回合你的所有手牌具有+1花费和</w:t>
-      </w:r>
-      <w:r>
-        <w:rPr>
-          <w:rFonts w:hint="eastAsia"/>
-          <w:b w:val="1"/>
-          <w:bCs w:val="1"/>
-          <w:color w:val="EFC851"/>
-          <w:sz w:val="18"/>
-          <w:szCs w:val="22"/>
-          <w:lang w:val="en-US" w:eastAsia="zh-CN"/>
-        </w:rPr>
-        <w:t>重放</w:t>
+        <w:t>X</w:t>
       </w:r>
       <w:r>
         <w:rPr>
@@ -19503,7 +19810,81 @@
           <w:sz w:val="18"/>
           <w:u w:val="none"/>
         </w:rPr>
+        <w:t xml:space="preserve"> </w:t>
+      </w:r>
+      <w:r>
+        <w:rPr>
+          <w:rFonts w:hint="eastAsia"/>
+          <w:b w:val="1"/>
+          <w:i w:val="0"/>
+          <w:strike w:val="0"/>
+          <w:color w:val="00B050"/>
+          <w:spacing w:val="0"/>
+          <w:sz w:val="18"/>
+          <w:u w:val="none"/>
+        </w:rPr>
+        <w:t>(X+1）</w:t>
+      </w:r>
+      <w:r>
+        <w:rPr>
+          <w:rFonts w:hint="eastAsia"/>
+          <w:b w:val="1"/>
+          <w:i w:val="0"/>
+          <w:strike w:val="0"/>
+          <w:spacing w:val="0"/>
+          <w:sz w:val="18"/>
+          <w:u w:val="none"/>
+        </w:rPr>
+        <w:t>张牌。下回合你的所有手牌具有+1花费和</w:t>
+      </w:r>
+      <w:r>
+        <w:rPr>
+          <w:rFonts w:hint="eastAsia"/>
+          <w:b w:val="1"/>
+          <w:bCs w:val="1"/>
+          <w:color w:val="EFC851"/>
+          <w:sz w:val="18"/>
+          <w:szCs w:val="22"/>
+          <w:lang w:val="en-US" w:eastAsia="zh-CN"/>
+        </w:rPr>
+        <w:t>重放</w:t>
+      </w:r>
+      <w:r>
+        <w:rPr>
+          <w:rFonts w:hint="eastAsia"/>
+          <w:b w:val="1"/>
+          <w:i w:val="0"/>
+          <w:strike w:val="0"/>
+          <w:spacing w:val="0"/>
+          <w:sz w:val="18"/>
+          <w:u w:val="none"/>
+        </w:rPr>
         <w:t>1。</w:t>
+      </w:r>
+      <w:r>
+        <w:rPr>
+          <w:rFonts w:hint="eastAsia"/>
+          <w:b w:val="1"/>
+          <w:i w:val="0"/>
+          <w:strike w:val="0"/>
+          <w:color w:val="FFC000"/>
+          <w:spacing w:val="0"/>
+          <w:sz w:val="18"/>
+          <w:u w:val="none"/>
+        </w:rPr>
+        <w:t>消耗</w:t>
+      </w:r>
+      <w:r>
+        <w:rPr>
+          <w:rFonts w:hint="eastAsia"/>
+          <w:b w:val="1"/>
+          <w:i w:val="0"/>
+          <w:strike w:val="0"/>
+          <w:spacing w:val="0"/>
+          <w:sz w:val="18"/>
+          <w:u w:val="none"/>
+        </w:rPr>
+        <w:t>。</w:t>
       </w:r>
     </w:p>
     <w:p>
@@ -19790,7 +20171,29 @@
           <w:szCs w:val="22"/>
           <w:lang w:val="en-US" w:eastAsia="zh-CN"/>
         </w:rPr>
-        <w:t>所有晶化牌具有“在手中时，你具有2点</w:t>
+        <w:t>所有晶化牌具有“在手中时，你具有</w:t>
+      </w:r>
+      <w:r>
+        <w:rPr>
+          <w:rFonts w:hint="eastAsia"/>
+          <w:b w:val="1"/>
+          <w:bCs w:val="1"/>
+          <w:sz w:val="18"/>
+          <w:szCs w:val="22"/>
+          <w:lang w:val="en-US" w:eastAsia="zh-CN"/>
+        </w:rPr>
+        <w:t>1</w:t>
+      </w:r>
+      <w:r>
+        <w:rPr>
+          <w:rFonts w:hint="eastAsia"/>
+          <w:b w:val="1"/>
+          <w:bCs w:val="1"/>
+          <w:sz w:val="18"/>
+          <w:szCs w:val="22"/>
+          <w:lang w:val="en-US" w:eastAsia="zh-CN"/>
+        </w:rPr>
+        <w:t>点</w:t>
       </w:r>
       <w:r>
         <w:rPr>
@@ -19813,7 +20216,29 @@
           <w:szCs w:val="22"/>
           <w:lang w:val="en-US" w:eastAsia="zh-CN"/>
         </w:rPr>
-        <w:t>和2点</w:t>
+        <w:t>和</w:t>
+      </w:r>
+      <w:r>
+        <w:rPr>
+          <w:rFonts w:hint="eastAsia"/>
+          <w:b w:val="1"/>
+          <w:bCs w:val="1"/>
+          <w:sz w:val="18"/>
+          <w:szCs w:val="22"/>
+          <w:lang w:val="en-US" w:eastAsia="zh-CN"/>
+        </w:rPr>
+        <w:t>1</w:t>
+      </w:r>
+      <w:r>
+        <w:rPr>
+          <w:rFonts w:hint="eastAsia"/>
+          <w:b w:val="1"/>
+          <w:bCs w:val="1"/>
+          <w:sz w:val="18"/>
+          <w:szCs w:val="22"/>
+          <w:lang w:val="en-US" w:eastAsia="zh-CN"/>
+        </w:rPr>
+        <w:t>点</w:t>
       </w:r>
       <w:r>
         <w:rPr>
@@ -20660,255 +21085,271 @@
     <w:pPrDefault/>
   </w:docDefaults>
   <w:latentStyles w:defLockedState="0" w:defUIPriority="99" w:defSemiHidden="1" w:defUnhideWhenUsed="1" w:defQFormat="0" w:count="260">
+    <w:lsdException w:name="Table Classic 4" w:uiPriority="0" w:semiHidden="0" w:unhideWhenUsed="0"/>
+    <w:lsdException w:name="Message Header" w:uiPriority="0" w:semiHidden="0" w:unhideWhenUsed="0"/>
+    <w:lsdException w:name="Medium Grid 3" w:uiPriority="69" w:semiHidden="0" w:unhideWhenUsed="0"/>
+    <w:lsdException w:name="Medium Shading 1 Accent 1" w:uiPriority="63" w:semiHidden="0" w:unhideWhenUsed="0"/>
+    <w:lsdException w:name="List Bullet 3" w:uiPriority="0" w:semiHidden="0" w:unhideWhenUsed="0"/>
+    <w:lsdException w:name="List Continue 2" w:uiPriority="0" w:semiHidden="0" w:unhideWhenUsed="0"/>
+    <w:lsdException w:name="Title" w:uiPriority="0" w:semiHidden="0" w:unhideWhenUsed="0" w:qFormat="1"/>
+    <w:lsdException w:name="Balloon Text" w:uiPriority="0" w:semiHidden="0" w:unhideWhenUsed="0"/>
+    <w:lsdException w:name="Medium Grid 2 Accent 6" w:uiPriority="68" w:semiHidden="0" w:unhideWhenUsed="0"/>
+    <w:lsdException w:name="Table Grid" w:uiPriority="0" w:semiHidden="0" w:unhideWhenUsed="0"/>
+    <w:lsdException w:name="Light Shading Accent 3" w:uiPriority="60" w:semiHidden="0" w:unhideWhenUsed="0"/>
+    <w:lsdException w:name="Dark List Accent 1" w:uiPriority="70" w:semiHidden="0" w:unhideWhenUsed="0"/>
+    <w:lsdException w:name="index 8" w:uiPriority="0" w:semiHidden="0" w:unhideWhenUsed="0"/>
+    <w:lsdException w:name="List 4" w:uiPriority="0" w:semiHidden="0" w:unhideWhenUsed="0"/>
+    <w:lsdException w:name="Table Columns 5" w:uiPriority="0" w:semiHidden="0" w:unhideWhenUsed="0"/>
+    <w:lsdException w:name="List Number 4" w:uiPriority="0" w:semiHidden="0" w:unhideWhenUsed="0"/>
+    <w:lsdException w:name="annotation text" w:uiPriority="0" w:semiHidden="0" w:unhideWhenUsed="0"/>
+    <w:lsdException w:name="toa heading" w:uiPriority="0" w:semiHidden="0" w:unhideWhenUsed="0"/>
+    <w:lsdException w:name="Strong" w:uiPriority="0" w:semiHidden="0" w:unhideWhenUsed="0" w:qFormat="1"/>
+    <w:lsdException w:name="Medium Grid 3 Accent 6" w:uiPriority="69" w:semiHidden="0" w:unhideWhenUsed="0"/>
+    <w:lsdException w:name="page number" w:uiPriority="0" w:semiHidden="0" w:unhideWhenUsed="0"/>
+    <w:lsdException w:name="heading 5" w:uiPriority="0" w:qFormat="1"/>
+    <w:lsdException w:name="Colorful Grid Accent 6" w:uiPriority="73" w:semiHidden="0" w:unhideWhenUsed="0"/>
+    <w:lsdException w:name="Medium Grid 2 Accent 4" w:uiPriority="68" w:semiHidden="0" w:unhideWhenUsed="0"/>
+    <w:lsdException w:name="Medium Shading 2 Accent 5" w:uiPriority="64" w:semiHidden="0" w:unhideWhenUsed="0"/>
+    <w:lsdException w:name="Table Simple 2" w:uiPriority="0" w:semiHidden="0" w:unhideWhenUsed="0"/>
+    <w:lsdException w:name="Table Grid 2" w:uiPriority="0" w:semiHidden="0" w:unhideWhenUsed="0"/>
+    <w:lsdException w:name="footnote reference" w:uiPriority="0" w:semiHidden="0" w:unhideWhenUsed="0"/>
+    <w:lsdException w:name="Medium Shading 1 Accent 3" w:uiPriority="63" w:semiHidden="0" w:unhideWhenUsed="0"/>
+    <w:lsdException w:name="Table 3D effects 1" w:uiPriority="0" w:semiHidden="0" w:unhideWhenUsed="0"/>
+    <w:lsdException w:name="Body Text Indent 2" w:uiPriority="0" w:semiHidden="0" w:unhideWhenUsed="0"/>
+    <w:lsdException w:name="HTML Variable" w:uiPriority="0" w:semiHidden="0" w:unhideWhenUsed="0"/>
+    <w:lsdException w:name="heading 1" w:uiPriority="0" w:semiHidden="0" w:unhideWhenUsed="0" w:qFormat="1"/>
+    <w:lsdException w:name="List Continue 4" w:uiPriority="0" w:semiHidden="0" w:unhideWhenUsed="0"/>
+    <w:lsdException w:name="Medium Shading 2" w:uiPriority="64" w:semiHidden="0" w:unhideWhenUsed="0"/>
+    <w:lsdException w:name="heading 7" w:uiPriority="0" w:qFormat="1"/>
+    <w:lsdException w:name="Table Grid 1" w:uiPriority="0" w:semiHidden="0" w:unhideWhenUsed="0"/>
+    <w:lsdException w:name="table of authorities" w:uiPriority="0" w:semiHidden="0" w:unhideWhenUsed="0"/>
+    <w:lsdException w:name="Date" w:uiPriority="0" w:semiHidden="0" w:unhideWhenUsed="0"/>
+    <w:lsdException w:name="List" w:uiPriority="0" w:semiHidden="0" w:unhideWhenUsed="0"/>
+    <w:lsdException w:name="Colorful List Accent 6" w:uiPriority="72" w:semiHidden="0" w:unhideWhenUsed="0"/>
+    <w:lsdException w:name="Medium Shading 1 Accent 6" w:uiPriority="63" w:semiHidden="0" w:unhideWhenUsed="0"/>
+    <w:lsdException w:name="Emphasis" w:uiPriority="0" w:semiHidden="0" w:unhideWhenUsed="0" w:qFormat="1"/>
+    <w:lsdException w:name="Light Shading Accent 4" w:uiPriority="60" w:semiHidden="0" w:unhideWhenUsed="0"/>
+    <w:lsdException w:name="heading 8" w:uiPriority="0" w:qFormat="1"/>
+    <w:lsdException w:name="Medium Grid 2 Accent 5" w:uiPriority="68" w:semiHidden="0" w:unhideWhenUsed="0"/>
+    <w:lsdException w:name="Table Colorful 2" w:uiPriority="0" w:semiHidden="0" w:unhideWhenUsed="0"/>
+    <w:lsdException w:name="toc 8" w:uiPriority="0" w:semiHidden="0" w:unhideWhenUsed="0"/>
+    <w:lsdException w:name="header" w:uiPriority="0" w:semiHidden="0" w:unhideWhenUsed="0"/>
+    <w:lsdException w:name="heading 3" w:uiPriority="0" w:qFormat="1"/>
+    <w:lsdException w:name="Body Text Indent" w:uiPriority="0" w:semiHidden="0" w:unhideWhenUsed="0"/>
+    <w:lsdException w:name="Table Theme" w:uiPriority="0" w:semiHidden="0" w:unhideWhenUsed="0"/>
+    <w:lsdException w:name="List Continue 5" w:uiPriority="0" w:semiHidden="0" w:unhideWhenUsed="0"/>
+    <w:lsdException w:name="Medium Grid 1 Accent 1" w:uiPriority="67" w:semiHidden="0" w:unhideWhenUsed="0"/>
+    <w:lsdException w:name="FollowedHyperlink" w:uiPriority="0" w:semiHidden="0" w:unhideWhenUsed="0"/>
+    <w:lsdException w:name="Colorful Shading Accent 1" w:uiPriority="71" w:semiHidden="0" w:unhideWhenUsed="0"/>
+    <w:lsdException w:name="Table Web 3" w:uiPriority="0" w:semiHidden="0" w:unhideWhenUsed="0"/>
+    <w:lsdException w:name="List Continue" w:uiPriority="0" w:semiHidden="0" w:unhideWhenUsed="0"/>
+    <w:lsdException w:name="Body Text" w:uiPriority="0" w:semiHidden="0" w:unhideWhenUsed="0"/>
+    <w:lsdException w:name="Medium Grid 1 Accent 3" w:uiPriority="67" w:semiHidden="0" w:unhideWhenUsed="0"/>
+    <w:lsdException w:name="List Bullet" w:uiPriority="0" w:semiHidden="0" w:unhideWhenUsed="0"/>
+    <w:lsdException w:name="Medium Grid 3 Accent 2" w:uiPriority="69" w:semiHidden="0" w:unhideWhenUsed="0"/>
+    <w:lsdException w:name="Table Colorful 3" w:uiPriority="0" w:semiHidden="0" w:unhideWhenUsed="0"/>
+    <w:lsdException w:name="index 7" w:uiPriority="0" w:semiHidden="0" w:unhideWhenUsed="0"/>
+    <w:lsdException w:name="envelope return" w:uiPriority="0" w:semiHidden="0" w:unhideWhenUsed="0"/>
+    <w:lsdException w:name="heading 9" w:uiPriority="0" w:qFormat="1"/>
+    <w:lsdException w:name="Medium List 1 Accent 2" w:uiPriority="65" w:semiHidden="0" w:unhideWhenUsed="0"/>
+    <w:lsdException w:name="Table Grid 3" w:uiPriority="0" w:semiHidden="0" w:unhideWhenUsed="0"/>
+    <w:lsdException w:name="Medium List 1 Accent 3" w:uiPriority="65" w:semiHidden="0" w:unhideWhenUsed="0"/>
+    <w:lsdException w:name="Light Shading Accent 6" w:uiPriority="60" w:semiHidden="0" w:unhideWhenUsed="0"/>
+    <w:lsdException w:name="Signature" w:uiPriority="0" w:semiHidden="0" w:unhideWhenUsed="0"/>
+    <w:lsdException w:name="Medium List 2 Accent 4" w:uiPriority="66" w:semiHidden="0" w:unhideWhenUsed="0"/>
+    <w:lsdException w:name="Table Web 2" w:uiPriority="0" w:semiHidden="0" w:unhideWhenUsed="0"/>
+    <w:lsdException w:name="Medium List 2 Accent 2" w:uiPriority="66" w:semiHidden="0" w:unhideWhenUsed="0"/>
+    <w:lsdException w:name="Light Shading Accent 5" w:uiPriority="60" w:semiHidden="0" w:unhideWhenUsed="0"/>
+    <w:lsdException w:name="Medium List 1 Accent 6" w:uiPriority="65" w:semiHidden="0" w:unhideWhenUsed="0"/>
+    <w:lsdException w:name="Table 3D effects 2" w:uiPriority="0" w:semiHidden="0" w:unhideWhenUsed="0"/>
+    <w:lsdException w:name="HTML Keyboard" w:uiPriority="0" w:semiHidden="0" w:unhideWhenUsed="0"/>
+    <w:lsdException w:name="heading 6" w:uiPriority="0" w:qFormat="1"/>
+    <w:lsdException w:name="toc 5" w:uiPriority="0" w:semiHidden="0" w:unhideWhenUsed="0"/>
+    <w:lsdException w:name="index 2" w:uiPriority="0" w:semiHidden="0" w:unhideWhenUsed="0"/>
+    <w:lsdException w:name="Medium List 2 Accent 5" w:uiPriority="66" w:semiHidden="0" w:unhideWhenUsed="0"/>
+    <w:lsdException w:name="List Number 2" w:uiPriority="0" w:semiHidden="0" w:unhideWhenUsed="0"/>
+    <w:lsdException w:name="Light List Accent 6" w:uiPriority="61" w:semiHidden="0" w:unhideWhenUsed="0"/>
+    <w:lsdException w:name="Light List Accent 4" w:uiPriority="61" w:semiHidden="0" w:unhideWhenUsed="0"/>
+    <w:lsdException w:name="Medium List 2 Accent 3" w:uiPriority="66" w:semiHidden="0" w:unhideWhenUsed="0"/>
+    <w:lsdException w:name="Colorful Grid Accent 1" w:uiPriority="73" w:semiHidden="0" w:unhideWhenUsed="0"/>
+    <w:lsdException w:name="Table List 8" w:uiPriority="0" w:semiHidden="0" w:unhideWhenUsed="0"/>
+    <w:lsdException w:name="Medium Shading 2 Accent 4" w:uiPriority="64" w:semiHidden="0" w:unhideWhenUsed="0"/>
+    <w:lsdException w:name="Light Grid" w:uiPriority="62" w:semiHidden="0" w:unhideWhenUsed="0"/>
+    <w:lsdException w:name="Medium Grid 1 Accent 2" w:uiPriority="67" w:semiHidden="0" w:unhideWhenUsed="0"/>
+    <w:lsdException w:name="endnote text" w:uiPriority="0" w:semiHidden="0" w:unhideWhenUsed="0"/>
+    <w:lsdException w:name="index 5" w:uiPriority="0" w:semiHidden="0" w:unhideWhenUsed="0"/>
+    <w:lsdException w:name="Colorful Shading Accent 6" w:uiPriority="71" w:semiHidden="0" w:unhideWhenUsed="0"/>
+    <w:lsdException w:name="Medium Shading 1 Accent 5" w:uiPriority="63" w:semiHidden="0" w:unhideWhenUsed="0"/>
+    <w:lsdException w:name="Colorful Grid Accent 4" w:uiPriority="73" w:semiHidden="0" w:unhideWhenUsed="0"/>
+    <w:lsdException w:name="Colorful Grid" w:uiPriority="73" w:semiHidden="0" w:unhideWhenUsed="0"/>
+    <w:lsdException w:name="Medium Shading 1" w:uiPriority="63" w:semiHidden="0" w:unhideWhenUsed="0"/>
+    <w:lsdException w:name="Medium Shading 2 Accent 3" w:uiPriority="64" w:semiHidden="0" w:unhideWhenUsed="0"/>
+    <w:lsdException w:name="Block Text" w:uiPriority="0" w:semiHidden="0" w:unhideWhenUsed="0"/>
+    <w:lsdException w:name="Medium Shading 2 Accent 6" w:uiPriority="64" w:semiHidden="0" w:unhideWhenUsed="0"/>
+    <w:lsdException w:name="footnote text" w:uiPriority="0" w:semiHidden="0" w:unhideWhenUsed="0"/>
+    <w:lsdException w:name="Colorful Shading Accent 4" w:uiPriority="71" w:semiHidden="0" w:unhideWhenUsed="0"/>
+    <w:lsdException w:name="Body Text 3" w:uiPriority="0" w:semiHidden="0" w:unhideWhenUsed="0"/>
+    <w:lsdException w:name="index 9" w:uiPriority="0" w:semiHidden="0" w:unhideWhenUsed="0"/>
+    <w:lsdException w:name="Table Grid 8" w:uiPriority="0" w:semiHidden="0" w:unhideWhenUsed="0"/>
+    <w:lsdException w:name="Plain Text" w:uiPriority="0" w:semiHidden="0" w:unhideWhenUsed="0"/>
+    <w:lsdException w:name="Medium List 1" w:uiPriority="65" w:semiHidden="0" w:unhideWhenUsed="0"/>
+    <w:lsdException w:name="Table Columns 1" w:uiPriority="0" w:semiHidden="0" w:unhideWhenUsed="0"/>
+    <w:lsdException w:name="macro" w:uiPriority="0" w:semiHidden="0" w:unhideWhenUsed="0"/>
+    <w:lsdException w:name="Table List 6" w:uiPriority="0" w:semiHidden="0" w:unhideWhenUsed="0"/>
+    <w:lsdException w:name="Table Columns 4" w:uiPriority="0" w:semiHidden="0" w:unhideWhenUsed="0"/>
+    <w:lsdException w:name="Table Grid 6" w:uiPriority="0" w:semiHidden="0" w:unhideWhenUsed="0"/>
+    <w:lsdException w:name="Light Shading Accent 2" w:uiPriority="60" w:semiHidden="0" w:unhideWhenUsed="0"/>
+    <w:lsdException w:name="Colorful Grid Accent 2" w:uiPriority="73" w:semiHidden="0" w:unhideWhenUsed="0"/>
+    <w:lsdException w:name="HTML Typewriter" w:uiPriority="0" w:semiHidden="0" w:unhideWhenUsed="0"/>
+    <w:lsdException w:name="List Bullet 5" w:uiPriority="0" w:semiHidden="0" w:unhideWhenUsed="0"/>
+    <w:lsdException w:name="Colorful List Accent 3" w:uiPriority="72" w:semiHidden="0" w:unhideWhenUsed="0"/>
+    <w:lsdException w:name="footer" w:uiPriority="0" w:semiHidden="0" w:unhideWhenUsed="0"/>
+    <w:lsdException w:name="Normal Indent" w:uiPriority="0" w:semiHidden="0" w:unhideWhenUsed="0"/>
+    <w:lsdException w:name="Table Elegant" w:uiPriority="0" w:semiHidden="0" w:unhideWhenUsed="0"/>
+    <w:lsdException w:name="line number" w:uiPriority="0" w:semiHidden="0" w:unhideWhenUsed="0"/>
+    <w:lsdException w:name="Body Text First Indent" w:uiPriority="0" w:semiHidden="0" w:unhideWhenUsed="0"/>
+    <w:lsdException w:name="Table Columns 2" w:uiPriority="0" w:semiHidden="0" w:unhideWhenUsed="0"/>
+    <w:lsdException w:name="Medium Grid 3 Accent 1" w:uiPriority="69" w:semiHidden="0" w:unhideWhenUsed="0"/>
+    <w:lsdException w:name="Dark List" w:uiPriority="70" w:semiHidden="0" w:unhideWhenUsed="0"/>
+    <w:lsdException w:name="Medium Grid 2 Accent 1" w:uiPriority="68" w:semiHidden="0" w:unhideWhenUsed="0"/>
+    <w:lsdException w:name="Colorful List Accent 4" w:uiPriority="72" w:semiHidden="0" w:unhideWhenUsed="0"/>
+    <w:lsdException w:name="List Bullet 2" w:uiPriority="0" w:semiHidden="0" w:unhideWhenUsed="0"/>
+    <w:lsdException w:name="Table Web 1" w:uiPriority="0" w:semiHidden="0" w:unhideWhenUsed="0"/>
+    <w:lsdException w:name="Light Grid Accent 2" w:uiPriority="62" w:semiHidden="0" w:unhideWhenUsed="0"/>
+    <w:lsdException w:name="Medium Grid 1" w:uiPriority="67" w:semiHidden="0" w:unhideWhenUsed="0"/>
+    <w:lsdException w:name="List 5" w:uiPriority="0" w:semiHidden="0" w:unhideWhenUsed="0"/>
+    <w:lsdException w:name="Medium Grid 2" w:uiPriority="68" w:semiHidden="0" w:unhideWhenUsed="0"/>
+    <w:lsdException w:name="Table Contemporary" w:uiPriority="0" w:semiHidden="0" w:unhideWhenUsed="0"/>
+    <w:lsdException w:name="HTML Code" w:uiPriority="0" w:semiHidden="0" w:unhideWhenUsed="0"/>
+    <w:lsdException w:name="Table List 3" w:uiPriority="0" w:semiHidden="0" w:unhideWhenUsed="0"/>
+    <w:lsdException w:name="Medium Grid 1 Accent 6" w:uiPriority="67" w:semiHidden="0" w:unhideWhenUsed="0"/>
+    <w:lsdException w:name="Normal Table" w:uiPriority="0" w:unhideWhenUsed="0" w:qFormat="1"/>
+    <w:lsdException w:name="Body Text First Indent 2" w:uiPriority="0" w:semiHidden="0" w:unhideWhenUsed="0"/>
+    <w:lsdException w:name="Dark List Accent 3" w:uiPriority="70" w:semiHidden="0" w:unhideWhenUsed="0"/>
+    <w:lsdException w:name="Medium Shading 1 Accent 4" w:uiPriority="63" w:semiHidden="0" w:unhideWhenUsed="0"/>
+    <w:lsdException w:name="toc 1" w:uiPriority="0" w:semiHidden="0" w:unhideWhenUsed="0"/>
+    <w:lsdException w:name="Medium List 2 Accent 6" w:uiPriority="66" w:semiHidden="0" w:unhideWhenUsed="0"/>
+    <w:lsdException w:name="Medium Grid 2 Accent 3" w:uiPriority="68" w:semiHidden="0" w:unhideWhenUsed="0"/>
+    <w:lsdException w:name="Light Grid Accent 1" w:uiPriority="62" w:semiHidden="0" w:unhideWhenUsed="0"/>
+    <w:lsdException w:name="Medium Grid 1 Accent 5" w:uiPriority="67" w:semiHidden="0" w:unhideWhenUsed="0"/>
+    <w:lsdException w:name="Colorful List Accent 1" w:uiPriority="72" w:semiHidden="0" w:unhideWhenUsed="0"/>
+    <w:lsdException w:name="envelope address" w:uiPriority="0" w:semiHidden="0" w:unhideWhenUsed="0"/>
+    <w:lsdException w:name="Medium Shading 1 Accent 2" w:uiPriority="63" w:semiHidden="0" w:unhideWhenUsed="0"/>
+    <w:lsdException w:name="Colorful List Accent 5" w:uiPriority="72" w:semiHidden="0" w:unhideWhenUsed="0"/>
+    <w:lsdException w:name="HTML Sample" w:uiPriority="0" w:semiHidden="0" w:unhideWhenUsed="0"/>
+    <w:lsdException w:name="Default Paragraph Font" w:uiPriority="0" w:unhideWhenUsed="0" w:qFormat="1"/>
+    <w:lsdException w:name="Table Simple 1" w:uiPriority="0" w:semiHidden="0" w:unhideWhenUsed="0"/>
+    <w:lsdException w:name="Table Professional" w:uiPriority="0" w:semiHidden="0" w:unhideWhenUsed="0"/>
+    <w:lsdException w:name="Hyperlink" w:uiPriority="0" w:semiHidden="0" w:unhideWhenUsed="0"/>
+    <w:lsdException w:name="toc 7" w:uiPriority="0" w:semiHidden="0" w:unhideWhenUsed="0"/>
+    <w:lsdException w:name="index 4" w:uiPriority="0" w:semiHidden="0" w:unhideWhenUsed="0"/>
+    <w:lsdException w:name="Table List 1" w:uiPriority="0" w:semiHidden="0" w:unhideWhenUsed="0"/>
+    <w:lsdException w:name="Light List" w:uiPriority="61" w:semiHidden="0" w:unhideWhenUsed="0"/>
+    <w:lsdException w:name="toc 3" w:uiPriority="0" w:semiHidden="0" w:unhideWhenUsed="0"/>
+    <w:lsdException w:name="Table Subtle 2" w:uiPriority="0" w:semiHidden="0" w:unhideWhenUsed="0"/>
+    <w:lsdException w:name="Medium Shading 2 Accent 1" w:uiPriority="64" w:semiHidden="0" w:unhideWhenUsed="0"/>
+    <w:lsdException w:name="HTML Preformatted" w:uiPriority="0" w:semiHidden="0" w:unhideWhenUsed="0"/>
+    <w:lsdException w:name="Dark List Accent 4" w:uiPriority="70" w:semiHidden="0" w:unhideWhenUsed="0"/>
+    <w:lsdException w:name="Table List 5" w:uiPriority="0" w:semiHidden="0" w:unhideWhenUsed="0"/>
+    <w:lsdException w:name="Normal" w:uiPriority="0" w:semiHidden="0" w:unhideWhenUsed="0" w:qFormat="1"/>
+    <w:lsdException w:name="List Number 5" w:uiPriority="0" w:semiHidden="0" w:unhideWhenUsed="0"/>
+    <w:lsdException w:name="Body Text 2" w:uiPriority="0" w:semiHidden="0" w:unhideWhenUsed="0"/>
+    <w:lsdException w:name="Body Text Indent 3" w:uiPriority="0" w:semiHidden="0" w:unhideWhenUsed="0"/>
+    <w:lsdException w:name="Colorful Shading Accent 2" w:uiPriority="71" w:semiHidden="0" w:unhideWhenUsed="0"/>
+    <w:lsdException w:name="Colorful Shading Accent 5" w:uiPriority="71" w:semiHidden="0" w:unhideWhenUsed="0"/>
+    <w:lsdException w:name="HTML Address" w:uiPriority="0" w:semiHidden="0" w:unhideWhenUsed="0"/>
+    <w:lsdException w:name="Table Simple 3" w:uiPriority="0" w:semiHidden="0" w:unhideWhenUsed="0"/>
+    <w:lsdException w:name="Light Grid Accent 4" w:uiPriority="62" w:semiHidden="0" w:unhideWhenUsed="0"/>
+    <w:lsdException w:name="Colorful Grid Accent 3" w:uiPriority="73" w:semiHidden="0" w:unhideWhenUsed="0"/>
+    <w:lsdException w:name="Closing" w:uiPriority="0" w:semiHidden="0" w:unhideWhenUsed="0"/>
+    <w:lsdException w:name="Dark List Accent 6" w:uiPriority="70" w:semiHidden="0" w:unhideWhenUsed="0"/>
+    <w:lsdException w:name="Table 3D effects 3" w:uiPriority="0" w:semiHidden="0" w:unhideWhenUsed="0"/>
+    <w:lsdException w:name="Light Shading" w:uiPriority="60" w:semiHidden="0" w:unhideWhenUsed="0"/>
+    <w:lsdException w:name="List 3" w:uiPriority="0" w:semiHidden="0" w:unhideWhenUsed="0"/>
+    <w:lsdException w:name="Colorful Grid Accent 5" w:uiPriority="73" w:semiHidden="0" w:unhideWhenUsed="0"/>
+    <w:lsdException w:name="heading 4" w:uiPriority="0" w:qFormat="1"/>
+    <w:lsdException w:name="Table List 7" w:uiPriority="0" w:semiHidden="0" w:unhideWhenUsed="0"/>
+    <w:lsdException w:name="Medium List 1 Accent 1" w:uiPriority="65" w:semiHidden="0" w:unhideWhenUsed="0"/>
+    <w:lsdException w:name="Medium Grid 3 Accent 5" w:uiPriority="69" w:semiHidden="0" w:unhideWhenUsed="0"/>
+    <w:lsdException w:name="annotation reference" w:uiPriority="0" w:semiHidden="0" w:unhideWhenUsed="0"/>
+    <w:lsdException w:name="toc 2" w:uiPriority="0" w:semiHidden="0" w:unhideWhenUsed="0"/>
+    <w:lsdException w:name="List Bullet 4" w:uiPriority="0" w:semiHidden="0" w:unhideWhenUsed="0"/>
+    <w:lsdException w:name="Table Classic 2" w:uiPriority="0" w:semiHidden="0" w:unhideWhenUsed="0"/>
+    <w:lsdException w:name="index heading" w:uiPriority="0" w:semiHidden="0" w:unhideWhenUsed="0"/>
+    <w:lsdException w:name="List 2" w:uiPriority="0" w:semiHidden="0" w:unhideWhenUsed="0"/>
+    <w:lsdException w:name="Medium Grid 3 Accent 4" w:uiPriority="69" w:semiHidden="0" w:unhideWhenUsed="0"/>
+    <w:lsdException w:name="HTML Definition" w:uiPriority="0" w:semiHidden="0" w:unhideWhenUsed="0"/>
     <w:lsdException w:name="toc 4" w:uiPriority="0" w:semiHidden="0" w:unhideWhenUsed="0"/>
-    <w:lsdException w:name="Medium Grid 2 Accent 6" w:uiPriority="68" w:semiHidden="0" w:unhideWhenUsed="0"/>
-    <w:lsdException w:name="List Continue 5" w:uiPriority="0" w:semiHidden="0" w:unhideWhenUsed="0"/>
+    <w:lsdException w:name="toc 6" w:uiPriority="0" w:semiHidden="0" w:unhideWhenUsed="0"/>
+    <w:lsdException w:name="List Number 3" w:uiPriority="0" w:semiHidden="0" w:unhideWhenUsed="0"/>
+    <w:lsdException w:name="Normal (Web)" w:uiPriority="0" w:semiHidden="0" w:unhideWhenUsed="0"/>
+    <w:lsdException w:name="List Number" w:uiPriority="0" w:semiHidden="0" w:unhideWhenUsed="0"/>
+    <w:lsdException w:name="Light Grid Accent 3" w:uiPriority="62" w:semiHidden="0" w:unhideWhenUsed="0"/>
+    <w:lsdException w:name="index 3" w:uiPriority="0" w:semiHidden="0" w:unhideWhenUsed="0"/>
+    <w:lsdException w:name="Medium Grid 2 Accent 2" w:uiPriority="68" w:semiHidden="0" w:unhideWhenUsed="0"/>
+    <w:lsdException w:name="Colorful List Accent 2" w:uiPriority="72" w:semiHidden="0" w:unhideWhenUsed="0"/>
+    <w:lsdException w:name="Medium List 1 Accent 4" w:uiPriority="65" w:semiHidden="0" w:unhideWhenUsed="0"/>
+    <w:lsdException w:name="Document Map" w:uiPriority="0" w:semiHidden="0" w:unhideWhenUsed="0"/>
+    <w:lsdException w:name="Subtitle" w:uiPriority="0" w:semiHidden="0" w:unhideWhenUsed="0" w:qFormat="1"/>
+    <w:lsdException w:name="Table Columns 3" w:uiPriority="0" w:semiHidden="0" w:unhideWhenUsed="0"/>
+    <w:lsdException w:name="Note Heading" w:uiPriority="0" w:semiHidden="0" w:unhideWhenUsed="0"/>
+    <w:lsdException w:name="Light Grid Accent 5" w:uiPriority="62" w:semiHidden="0" w:unhideWhenUsed="0"/>
+    <w:lsdException w:name="Light List Accent 2" w:uiPriority="61" w:semiHidden="0" w:unhideWhenUsed="0"/>
+    <w:lsdException w:name="Colorful List" w:uiPriority="72" w:semiHidden="0" w:unhideWhenUsed="0"/>
+    <w:lsdException w:name="Table Grid 5" w:uiPriority="0" w:semiHidden="0" w:unhideWhenUsed="0"/>
+    <w:lsdException w:name="endnote reference" w:uiPriority="0" w:semiHidden="0" w:unhideWhenUsed="0"/>
+    <w:lsdException w:name="List Continue 3" w:uiPriority="0" w:semiHidden="0" w:unhideWhenUsed="0"/>
+    <w:lsdException w:name="toc 9" w:uiPriority="0" w:semiHidden="0" w:unhideWhenUsed="0"/>
+    <w:lsdException w:name="Table List 4" w:uiPriority="0" w:semiHidden="0" w:unhideWhenUsed="0"/>
+    <w:lsdException w:name="index 1" w:uiPriority="0" w:semiHidden="0" w:unhideWhenUsed="0"/>
+    <w:lsdException w:name="Table Colorful 1" w:uiPriority="0" w:semiHidden="0" w:unhideWhenUsed="0"/>
+    <w:lsdException w:name="caption" w:uiPriority="0" w:qFormat="1"/>
+    <w:lsdException w:name="Table Grid 4" w:uiPriority="0" w:semiHidden="0" w:unhideWhenUsed="0"/>
+    <w:lsdException w:name="Medium Grid 3 Accent 3" w:uiPriority="69" w:semiHidden="0" w:unhideWhenUsed="0"/>
+    <w:lsdException w:name="Light List Accent 3" w:uiPriority="61" w:semiHidden="0" w:unhideWhenUsed="0"/>
+    <w:lsdException w:name="HTML Acronym" w:uiPriority="0" w:semiHidden="0" w:unhideWhenUsed="0"/>
+    <w:lsdException w:name="HTML Cite" w:uiPriority="0" w:semiHidden="0" w:unhideWhenUsed="0"/>
+    <w:lsdException w:name="index 6" w:uiPriority="0" w:semiHidden="0" w:unhideWhenUsed="0"/>
+    <w:lsdException w:name="Table Subtle 1" w:uiPriority="0" w:semiHidden="0" w:unhideWhenUsed="0"/>
+    <w:lsdException w:name="Colorful Shading" w:uiPriority="71" w:semiHidden="0" w:unhideWhenUsed="0"/>
+    <w:lsdException w:name="heading 2" w:uiPriority="0" w:qFormat="1"/>
+    <w:lsdException w:name="Light List Accent 1" w:uiPriority="61" w:semiHidden="0" w:unhideWhenUsed="0"/>
     <w:lsdException w:name="Table Classic 3" w:uiPriority="0" w:semiHidden="0" w:unhideWhenUsed="0"/>
-    <w:lsdException w:name="HTML Preformatted" w:uiPriority="0" w:semiHidden="0" w:unhideWhenUsed="0"/>
-    <w:lsdException w:name="Default Paragraph Font" w:uiPriority="0" w:unhideWhenUsed="0" w:qFormat="1"/>
-    <w:lsdException w:name="Table Elegant" w:uiPriority="0" w:semiHidden="0" w:unhideWhenUsed="0"/>
-    <w:lsdException w:name="Table Columns 1" w:uiPriority="0" w:semiHidden="0" w:unhideWhenUsed="0"/>
-    <w:lsdException w:name="toc 7" w:uiPriority="0" w:semiHidden="0" w:unhideWhenUsed="0"/>
-    <w:lsdException w:name="Table List 5" w:uiPriority="0" w:semiHidden="0" w:unhideWhenUsed="0"/>
-    <w:lsdException w:name="List Continue" w:uiPriority="0" w:semiHidden="0" w:unhideWhenUsed="0"/>
-    <w:lsdException w:name="Medium Grid 3 Accent 1" w:uiPriority="69" w:semiHidden="0" w:unhideWhenUsed="0"/>
+    <w:lsdException w:name="table of figures" w:uiPriority="0" w:semiHidden="0" w:unhideWhenUsed="0"/>
+    <w:lsdException w:name="Medium Shading 2 Accent 2" w:uiPriority="64" w:semiHidden="0" w:unhideWhenUsed="0"/>
+    <w:lsdException w:name="Salutation" w:uiPriority="0" w:semiHidden="0" w:unhideWhenUsed="0"/>
+    <w:lsdException w:name="Dark List Accent 5" w:uiPriority="70" w:semiHidden="0" w:unhideWhenUsed="0"/>
+    <w:lsdException w:name="Medium List 2" w:uiPriority="66" w:semiHidden="0" w:unhideWhenUsed="0"/>
+    <w:lsdException w:name="Medium Grid 1 Accent 4" w:uiPriority="67" w:semiHidden="0" w:unhideWhenUsed="0"/>
+    <w:lsdException w:name="Medium List 2 Accent 1" w:uiPriority="66" w:semiHidden="0" w:unhideWhenUsed="0"/>
+    <w:lsdException w:name="Table Grid 7" w:uiPriority="0" w:semiHidden="0" w:unhideWhenUsed="0"/>
+    <w:lsdException w:name="Table List 2" w:uiPriority="0" w:semiHidden="0" w:unhideWhenUsed="0"/>
     <w:lsdException w:name="Colorful Shading Accent 3" w:uiPriority="71" w:semiHidden="0" w:unhideWhenUsed="0"/>
-    <w:lsdException w:name="Colorful List Accent 5" w:uiPriority="72" w:semiHidden="0" w:unhideWhenUsed="0"/>
-    <w:lsdException w:name="envelope address" w:uiPriority="0" w:semiHidden="0" w:unhideWhenUsed="0"/>
+    <w:lsdException w:name="Medium List 1 Accent 5" w:uiPriority="65" w:semiHidden="0" w:unhideWhenUsed="0"/>
+    <w:lsdException w:name="E-mail Signature" w:uiPriority="0" w:semiHidden="0" w:unhideWhenUsed="0"/>
     <w:lsdException w:name="Light Shading Accent 1" w:uiPriority="60" w:semiHidden="0" w:unhideWhenUsed="0"/>
-    <w:lsdException w:name="Medium Grid 2 Accent 3" w:uiPriority="68" w:semiHidden="0" w:unhideWhenUsed="0"/>
-    <w:lsdException w:name="Medium Grid 1 Accent 3" w:uiPriority="67" w:semiHidden="0" w:unhideWhenUsed="0"/>
+    <w:lsdException w:name="Light Grid Accent 6" w:uiPriority="62" w:semiHidden="0" w:unhideWhenUsed="0"/>
+    <w:lsdException w:name="Light List Accent 5" w:uiPriority="61" w:semiHidden="0" w:unhideWhenUsed="0"/>
     <w:lsdException w:name="Table Classic 1" w:uiPriority="0" w:semiHidden="0" w:unhideWhenUsed="0"/>
-    <w:lsdException w:name="Medium Grid 2 Accent 1" w:uiPriority="68" w:semiHidden="0" w:unhideWhenUsed="0"/>
-    <w:lsdException w:name="Dark List" w:uiPriority="70" w:semiHidden="0" w:unhideWhenUsed="0"/>
-    <w:lsdException w:name="toc 5" w:uiPriority="0" w:semiHidden="0" w:unhideWhenUsed="0"/>
-    <w:lsdException w:name="Medium Shading 1 Accent 2" w:uiPriority="63" w:semiHidden="0" w:unhideWhenUsed="0"/>
-    <w:lsdException w:name="Medium List 2" w:uiPriority="66" w:semiHidden="0" w:unhideWhenUsed="0"/>
-    <w:lsdException w:name="Colorful Grid Accent 4" w:uiPriority="73" w:semiHidden="0" w:unhideWhenUsed="0"/>
-    <w:lsdException w:name="HTML Code" w:uiPriority="0" w:semiHidden="0" w:unhideWhenUsed="0"/>
-    <w:lsdException w:name="Medium Shading 1 Accent 1" w:uiPriority="63" w:semiHidden="0" w:unhideWhenUsed="0"/>
-    <w:lsdException w:name="Colorful List Accent 1" w:uiPriority="72" w:semiHidden="0" w:unhideWhenUsed="0"/>
-    <w:lsdException w:name="HTML Variable" w:uiPriority="0" w:semiHidden="0" w:unhideWhenUsed="0"/>
-    <w:lsdException w:name="Medium Grid 3" w:uiPriority="69" w:semiHidden="0" w:unhideWhenUsed="0"/>
-    <w:lsdException w:name="table of figures" w:uiPriority="0" w:semiHidden="0" w:unhideWhenUsed="0"/>
-    <w:lsdException w:name="Medium Grid 1 Accent 5" w:uiPriority="67" w:semiHidden="0" w:unhideWhenUsed="0"/>
-    <w:lsdException w:name="Medium Grid 2 Accent 5" w:uiPriority="68" w:semiHidden="0" w:unhideWhenUsed="0"/>
-    <w:lsdException w:name="Medium List 2 Accent 3" w:uiPriority="66" w:semiHidden="0" w:unhideWhenUsed="0"/>
-    <w:lsdException w:name="toc 3" w:uiPriority="0" w:semiHidden="0" w:unhideWhenUsed="0"/>
-    <w:lsdException w:name="Closing" w:uiPriority="0" w:semiHidden="0" w:unhideWhenUsed="0"/>
-    <w:lsdException w:name="HTML Typewriter" w:uiPriority="0" w:semiHidden="0" w:unhideWhenUsed="0"/>
-    <w:lsdException w:name="line number" w:uiPriority="0" w:semiHidden="0" w:unhideWhenUsed="0"/>
-    <w:lsdException w:name="endnote reference" w:uiPriority="0" w:semiHidden="0" w:unhideWhenUsed="0"/>
-    <w:lsdException w:name="Normal Table" w:uiPriority="0" w:unhideWhenUsed="0" w:qFormat="1"/>
-    <w:lsdException w:name="index heading" w:uiPriority="0" w:semiHidden="0" w:unhideWhenUsed="0"/>
-    <w:lsdException w:name="Table Grid 5" w:uiPriority="0" w:semiHidden="0" w:unhideWhenUsed="0"/>
-    <w:lsdException w:name="Light Shading Accent 3" w:uiPriority="60" w:semiHidden="0" w:unhideWhenUsed="0"/>
-    <w:lsdException w:name="Note Heading" w:uiPriority="0" w:semiHidden="0" w:unhideWhenUsed="0"/>
-    <w:lsdException w:name="Table Classic 2" w:uiPriority="0" w:semiHidden="0" w:unhideWhenUsed="0"/>
-    <w:lsdException w:name="Medium Grid 3 Accent 4" w:uiPriority="69" w:semiHidden="0" w:unhideWhenUsed="0"/>
-    <w:lsdException w:name="Colorful Grid Accent 1" w:uiPriority="73" w:semiHidden="0" w:unhideWhenUsed="0"/>
-    <w:lsdException w:name="Date" w:uiPriority="0" w:semiHidden="0" w:unhideWhenUsed="0"/>
-    <w:lsdException w:name="Colorful Shading" w:uiPriority="71" w:semiHidden="0" w:unhideWhenUsed="0"/>
-    <w:lsdException w:name="Medium List 1 Accent 1" w:uiPriority="65" w:semiHidden="0" w:unhideWhenUsed="0"/>
-    <w:lsdException w:name="Body Text First Indent 2" w:uiPriority="0" w:semiHidden="0" w:unhideWhenUsed="0"/>
-    <w:lsdException w:name="Table Web 2" w:uiPriority="0" w:semiHidden="0" w:unhideWhenUsed="0"/>
-    <w:lsdException w:name="List Bullet 5" w:uiPriority="0" w:semiHidden="0" w:unhideWhenUsed="0"/>
-    <w:lsdException w:name="toa heading" w:uiPriority="0" w:semiHidden="0" w:unhideWhenUsed="0"/>
-    <w:lsdException w:name="Colorful Grid Accent 3" w:uiPriority="73" w:semiHidden="0" w:unhideWhenUsed="0"/>
-    <w:lsdException w:name="heading 9" w:uiPriority="0" w:qFormat="1"/>
-    <w:lsdException w:name="Colorful Shading Accent 4" w:uiPriority="71" w:semiHidden="0" w:unhideWhenUsed="0"/>
-    <w:lsdException w:name="Medium Grid 1 Accent 6" w:uiPriority="67" w:semiHidden="0" w:unhideWhenUsed="0"/>
-    <w:lsdException w:name="List Number 5" w:uiPriority="0" w:semiHidden="0" w:unhideWhenUsed="0"/>
-    <w:lsdException w:name="index 9" w:uiPriority="0" w:semiHidden="0" w:unhideWhenUsed="0"/>
-    <w:lsdException w:name="Medium List 2 Accent 6" w:uiPriority="66" w:semiHidden="0" w:unhideWhenUsed="0"/>
-    <w:lsdException w:name="Colorful Grid" w:uiPriority="73" w:semiHidden="0" w:unhideWhenUsed="0"/>
-    <w:lsdException w:name="heading 8" w:uiPriority="0" w:qFormat="1"/>
-    <w:lsdException w:name="List Number 4" w:uiPriority="0" w:semiHidden="0" w:unhideWhenUsed="0"/>
-    <w:lsdException w:name="index 3" w:uiPriority="0" w:semiHidden="0" w:unhideWhenUsed="0"/>
-    <w:lsdException w:name="Body Text Indent 3" w:uiPriority="0" w:semiHidden="0" w:unhideWhenUsed="0"/>
-    <w:lsdException w:name="Colorful List" w:uiPriority="72" w:semiHidden="0" w:unhideWhenUsed="0"/>
-    <w:lsdException w:name="HTML Sample" w:uiPriority="0" w:semiHidden="0" w:unhideWhenUsed="0"/>
-    <w:lsdException w:name="Medium List 2 Accent 1" w:uiPriority="66" w:semiHidden="0" w:unhideWhenUsed="0"/>
-    <w:lsdException w:name="caption" w:uiPriority="0" w:qFormat="1"/>
-    <w:lsdException w:name="Table Grid 2" w:uiPriority="0" w:semiHidden="0" w:unhideWhenUsed="0"/>
-    <w:lsdException w:name="heading 6" w:uiPriority="0" w:qFormat="1"/>
-    <w:lsdException w:name="Normal (Web)" w:uiPriority="0" w:semiHidden="0" w:unhideWhenUsed="0"/>
-    <w:lsdException w:name="Medium Shading 1 Accent 5" w:uiPriority="63" w:semiHidden="0" w:unhideWhenUsed="0"/>
-    <w:lsdException w:name="List Number 3" w:uiPriority="0" w:semiHidden="0" w:unhideWhenUsed="0"/>
-    <w:lsdException w:name="List Bullet 3" w:uiPriority="0" w:semiHidden="0" w:unhideWhenUsed="0"/>
-    <w:lsdException w:name="Table Simple 3" w:uiPriority="0" w:semiHidden="0" w:unhideWhenUsed="0"/>
-    <w:lsdException w:name="heading 3" w:uiPriority="0" w:qFormat="1"/>
-    <w:lsdException w:name="annotation text" w:uiPriority="0" w:semiHidden="0" w:unhideWhenUsed="0"/>
-    <w:lsdException w:name="Medium Grid 1 Accent 2" w:uiPriority="67" w:semiHidden="0" w:unhideWhenUsed="0"/>
-    <w:lsdException w:name="Body Text 2" w:uiPriority="0" w:semiHidden="0" w:unhideWhenUsed="0"/>
-    <w:lsdException w:name="index 5" w:uiPriority="0" w:semiHidden="0" w:unhideWhenUsed="0"/>
-    <w:lsdException w:name="Table Subtle 1" w:uiPriority="0" w:semiHidden="0" w:unhideWhenUsed="0"/>
-    <w:lsdException w:name="Medium List 1 Accent 6" w:uiPriority="65" w:semiHidden="0" w:unhideWhenUsed="0"/>
-    <w:lsdException w:name="footer" w:uiPriority="0" w:semiHidden="0" w:unhideWhenUsed="0"/>
-    <w:lsdException w:name="index 8" w:uiPriority="0" w:semiHidden="0" w:unhideWhenUsed="0"/>
-    <w:lsdException w:name="Normal Indent" w:uiPriority="0" w:semiHidden="0" w:unhideWhenUsed="0"/>
-    <w:lsdException w:name="annotation reference" w:uiPriority="0" w:semiHidden="0" w:unhideWhenUsed="0"/>
-    <w:lsdException w:name="Light List Accent 6" w:uiPriority="61" w:semiHidden="0" w:unhideWhenUsed="0"/>
-    <w:lsdException w:name="Table List 1" w:uiPriority="0" w:semiHidden="0" w:unhideWhenUsed="0"/>
-    <w:lsdException w:name="Table 3D effects 1" w:uiPriority="0" w:semiHidden="0" w:unhideWhenUsed="0"/>
-    <w:lsdException w:name="Table Grid" w:uiPriority="0" w:semiHidden="0" w:unhideWhenUsed="0"/>
-    <w:lsdException w:name="Table Grid 6" w:uiPriority="0" w:semiHidden="0" w:unhideWhenUsed="0"/>
-    <w:lsdException w:name="Medium Grid 3 Accent 2" w:uiPriority="69" w:semiHidden="0" w:unhideWhenUsed="0"/>
-    <w:lsdException w:name="Medium Shading 2 Accent 5" w:uiPriority="64" w:semiHidden="0" w:unhideWhenUsed="0"/>
-    <w:lsdException w:name="Dark List Accent 1" w:uiPriority="70" w:semiHidden="0" w:unhideWhenUsed="0"/>
-    <w:lsdException w:name="Table Web 1" w:uiPriority="0" w:semiHidden="0" w:unhideWhenUsed="0"/>
-    <w:lsdException w:name="Table Simple 2" w:uiPriority="0" w:semiHidden="0" w:unhideWhenUsed="0"/>
-    <w:lsdException w:name="Medium Shading 1 Accent 4" w:uiPriority="63" w:semiHidden="0" w:unhideWhenUsed="0"/>
-    <w:lsdException w:name="Table Columns 2" w:uiPriority="0" w:semiHidden="0" w:unhideWhenUsed="0"/>
-    <w:lsdException w:name="Light Grid" w:uiPriority="62" w:semiHidden="0" w:unhideWhenUsed="0"/>
-    <w:lsdException w:name="HTML Address" w:uiPriority="0" w:semiHidden="0" w:unhideWhenUsed="0"/>
-    <w:lsdException w:name="Table List 6" w:uiPriority="0" w:semiHidden="0" w:unhideWhenUsed="0"/>
-    <w:lsdException w:name="List Bullet" w:uiPriority="0" w:semiHidden="0" w:unhideWhenUsed="0"/>
-    <w:lsdException w:name="Table Classic 4" w:uiPriority="0" w:semiHidden="0" w:unhideWhenUsed="0"/>
-    <w:lsdException w:name="Dark List Accent 4" w:uiPriority="70" w:semiHidden="0" w:unhideWhenUsed="0"/>
-    <w:lsdException w:name="Light Shading" w:uiPriority="60" w:semiHidden="0" w:unhideWhenUsed="0"/>
-    <w:lsdException w:name="HTML Cite" w:uiPriority="0" w:semiHidden="0" w:unhideWhenUsed="0"/>
-    <w:lsdException w:name="Medium List 1" w:uiPriority="65" w:semiHidden="0" w:unhideWhenUsed="0"/>
-    <w:lsdException w:name="header" w:uiPriority="0" w:semiHidden="0" w:unhideWhenUsed="0"/>
-    <w:lsdException w:name="toc 6" w:uiPriority="0" w:semiHidden="0" w:unhideWhenUsed="0"/>
-    <w:lsdException w:name="Table Colorful 1" w:uiPriority="0" w:semiHidden="0" w:unhideWhenUsed="0"/>
-    <w:lsdException w:name="heading 5" w:uiPriority="0" w:qFormat="1"/>
-    <w:lsdException w:name="Medium List 2 Accent 4" w:uiPriority="66" w:semiHidden="0" w:unhideWhenUsed="0"/>
-    <w:lsdException w:name="Body Text Indent" w:uiPriority="0" w:semiHidden="0" w:unhideWhenUsed="0"/>
-    <w:lsdException w:name="Medium Shading 2 Accent 3" w:uiPriority="64" w:semiHidden="0" w:unhideWhenUsed="0"/>
-    <w:lsdException w:name="index 2" w:uiPriority="0" w:semiHidden="0" w:unhideWhenUsed="0"/>
-    <w:lsdException w:name="macro" w:uiPriority="0" w:semiHidden="0" w:unhideWhenUsed="0"/>
-    <w:lsdException w:name="Table Grid 1" w:uiPriority="0" w:semiHidden="0" w:unhideWhenUsed="0"/>
-    <w:lsdException w:name="Table Grid 8" w:uiPriority="0" w:semiHidden="0" w:unhideWhenUsed="0"/>
-    <w:lsdException w:name="toc 1" w:uiPriority="0" w:semiHidden="0" w:unhideWhenUsed="0"/>
-    <w:lsdException w:name="Light List" w:uiPriority="61" w:semiHidden="0" w:unhideWhenUsed="0"/>
-    <w:lsdException w:name="List 2" w:uiPriority="0" w:semiHidden="0" w:unhideWhenUsed="0"/>
-    <w:lsdException w:name="Colorful Grid Accent 2" w:uiPriority="73" w:semiHidden="0" w:unhideWhenUsed="0"/>
-    <w:lsdException w:name="Table Colorful 2" w:uiPriority="0" w:semiHidden="0" w:unhideWhenUsed="0"/>
-    <w:lsdException w:name="footnote reference" w:uiPriority="0" w:semiHidden="0" w:unhideWhenUsed="0"/>
-    <w:lsdException w:name="List 4" w:uiPriority="0" w:semiHidden="0" w:unhideWhenUsed="0"/>
-    <w:lsdException w:name="List 5" w:uiPriority="0" w:semiHidden="0" w:unhideWhenUsed="0"/>
-    <w:lsdException w:name="Document Map" w:uiPriority="0" w:semiHidden="0" w:unhideWhenUsed="0"/>
-    <w:lsdException w:name="envelope return" w:uiPriority="0" w:semiHidden="0" w:unhideWhenUsed="0"/>
-    <w:lsdException w:name="Light List Accent 3" w:uiPriority="61" w:semiHidden="0" w:unhideWhenUsed="0"/>
-    <w:lsdException w:name="Light Grid Accent 3" w:uiPriority="62" w:semiHidden="0" w:unhideWhenUsed="0"/>
-    <w:lsdException w:name="index 6" w:uiPriority="0" w:semiHidden="0" w:unhideWhenUsed="0"/>
-    <w:lsdException w:name="Medium Shading 1 Accent 6" w:uiPriority="63" w:semiHidden="0" w:unhideWhenUsed="0"/>
-    <w:lsdException w:name="Table Columns 3" w:uiPriority="0" w:semiHidden="0" w:unhideWhenUsed="0"/>
-    <w:lsdException w:name="table of authorities" w:uiPriority="0" w:semiHidden="0" w:unhideWhenUsed="0"/>
-    <w:lsdException w:name="Medium Shading 1 Accent 3" w:uiPriority="63" w:semiHidden="0" w:unhideWhenUsed="0"/>
-    <w:lsdException w:name="Light Shading Accent 4" w:uiPriority="60" w:semiHidden="0" w:unhideWhenUsed="0"/>
-    <w:lsdException w:name="Dark List Accent 6" w:uiPriority="70" w:semiHidden="0" w:unhideWhenUsed="0"/>
-    <w:lsdException w:name="Medium List 1 Accent 2" w:uiPriority="65" w:semiHidden="0" w:unhideWhenUsed="0"/>
-    <w:lsdException w:name="Table Grid 4" w:uiPriority="0" w:semiHidden="0" w:unhideWhenUsed="0"/>
-    <w:lsdException w:name="Dark List Accent 5" w:uiPriority="70" w:semiHidden="0" w:unhideWhenUsed="0"/>
-    <w:lsdException w:name="Colorful Shading Accent 2" w:uiPriority="71" w:semiHidden="0" w:unhideWhenUsed="0"/>
-    <w:lsdException w:name="Table List 4" w:uiPriority="0" w:semiHidden="0" w:unhideWhenUsed="0"/>
-    <w:lsdException w:name="Colorful Grid Accent 5" w:uiPriority="73" w:semiHidden="0" w:unhideWhenUsed="0"/>
-    <w:lsdException w:name="Hyperlink" w:uiPriority="0" w:semiHidden="0" w:unhideWhenUsed="0"/>
-    <w:lsdException w:name="List Continue 4" w:uiPriority="0" w:semiHidden="0" w:unhideWhenUsed="0"/>
-    <w:lsdException w:name="Table List 8" w:uiPriority="0" w:semiHidden="0" w:unhideWhenUsed="0"/>
-    <w:lsdException w:name="page number" w:uiPriority="0" w:semiHidden="0" w:unhideWhenUsed="0"/>
-    <w:lsdException w:name="HTML Definition" w:uiPriority="0" w:semiHidden="0" w:unhideWhenUsed="0"/>
-    <w:lsdException w:name="Medium Grid 2 Accent 2" w:uiPriority="68" w:semiHidden="0" w:unhideWhenUsed="0"/>
-    <w:lsdException w:name="List Bullet 2" w:uiPriority="0" w:semiHidden="0" w:unhideWhenUsed="0"/>
-    <w:lsdException w:name="FollowedHyperlink" w:uiPriority="0" w:semiHidden="0" w:unhideWhenUsed="0"/>
-    <w:lsdException w:name="Light Grid Accent 4" w:uiPriority="62" w:semiHidden="0" w:unhideWhenUsed="0"/>
-    <w:lsdException w:name="Table Theme" w:uiPriority="0" w:semiHidden="0" w:unhideWhenUsed="0"/>
-    <w:lsdException w:name="Medium List 2 Accent 2" w:uiPriority="66" w:semiHidden="0" w:unhideWhenUsed="0"/>
-    <w:lsdException w:name="Light Shading Accent 6" w:uiPriority="60" w:semiHidden="0" w:unhideWhenUsed="0"/>
-    <w:lsdException w:name="heading 7" w:uiPriority="0" w:qFormat="1"/>
-    <w:lsdException w:name="Colorful List Accent 2" w:uiPriority="72" w:semiHidden="0" w:unhideWhenUsed="0"/>
-    <w:lsdException w:name="heading 4" w:uiPriority="0" w:qFormat="1"/>
-    <w:lsdException w:name="List Number" w:uiPriority="0" w:semiHidden="0" w:unhideWhenUsed="0"/>
-    <w:lsdException w:name="Table Subtle 2" w:uiPriority="0" w:semiHidden="0" w:unhideWhenUsed="0"/>
-    <w:lsdException w:name="Table Grid 7" w:uiPriority="0" w:semiHidden="0" w:unhideWhenUsed="0"/>
-    <w:lsdException w:name="Signature" w:uiPriority="0" w:semiHidden="0" w:unhideWhenUsed="0"/>
-    <w:lsdException w:name="Light Shading Accent 5" w:uiPriority="60" w:semiHidden="0" w:unhideWhenUsed="0"/>
-    <w:lsdException w:name="Body Text" w:uiPriority="0" w:semiHidden="0" w:unhideWhenUsed="0"/>
-    <w:lsdException w:name="List 3" w:uiPriority="0" w:semiHidden="0" w:unhideWhenUsed="0"/>
-    <w:lsdException w:name="List" w:uiPriority="0" w:semiHidden="0" w:unhideWhenUsed="0"/>
-    <w:lsdException w:name="Medium Shading 2 Accent 2" w:uiPriority="64" w:semiHidden="0" w:unhideWhenUsed="0"/>
-    <w:lsdException w:name="Table 3D effects 2" w:uiPriority="0" w:semiHidden="0" w:unhideWhenUsed="0"/>
-    <w:lsdException w:name="Message Header" w:uiPriority="0" w:semiHidden="0" w:unhideWhenUsed="0"/>
-    <w:lsdException w:name="Table Grid 3" w:uiPriority="0" w:semiHidden="0" w:unhideWhenUsed="0"/>
-    <w:lsdException w:name="Salutation" w:uiPriority="0" w:semiHidden="0" w:unhideWhenUsed="0"/>
-    <w:lsdException w:name="Medium List 1 Accent 3" w:uiPriority="65" w:semiHidden="0" w:unhideWhenUsed="0"/>
-    <w:lsdException w:name="toc 9" w:uiPriority="0" w:semiHidden="0" w:unhideWhenUsed="0"/>
-    <w:lsdException w:name="Medium Grid 2" w:uiPriority="68" w:semiHidden="0" w:unhideWhenUsed="0"/>
-    <w:lsdException w:name="Plain Text" w:uiPriority="0" w:semiHidden="0" w:unhideWhenUsed="0"/>
-    <w:lsdException w:name="Medium Grid 1 Accent 4" w:uiPriority="67" w:semiHidden="0" w:unhideWhenUsed="0"/>
-    <w:lsdException w:name="Subtitle" w:uiPriority="0" w:semiHidden="0" w:unhideWhenUsed="0" w:qFormat="1"/>
-    <w:lsdException w:name="Medium List 1 Accent 4" w:uiPriority="65" w:semiHidden="0" w:unhideWhenUsed="0"/>
-    <w:lsdException w:name="HTML Keyboard" w:uiPriority="0" w:semiHidden="0" w:unhideWhenUsed="0"/>
-    <w:lsdException w:name="Table List 3" w:uiPriority="0" w:semiHidden="0" w:unhideWhenUsed="0"/>
-    <w:lsdException w:name="Light Grid Accent 6" w:uiPriority="62" w:semiHidden="0" w:unhideWhenUsed="0"/>
-    <w:lsdException w:name="Medium List 2 Accent 5" w:uiPriority="66" w:semiHidden="0" w:unhideWhenUsed="0"/>
-    <w:lsdException w:name="index 4" w:uiPriority="0" w:semiHidden="0" w:unhideWhenUsed="0"/>
+    <w:lsdException w:name="Dark List Accent 2" w:uiPriority="70" w:semiHidden="0" w:unhideWhenUsed="0"/>
     <w:lsdException w:name="annotation subject" w:uiPriority="0" w:semiHidden="0" w:unhideWhenUsed="0"/>
-    <w:lsdException w:name="Strong" w:uiPriority="0" w:semiHidden="0" w:unhideWhenUsed="0" w:qFormat="1"/>
-    <w:lsdException w:name="Table Professional" w:uiPriority="0" w:semiHidden="0" w:unhideWhenUsed="0"/>
-    <w:lsdException w:name="Colorful Shading Accent 1" w:uiPriority="71" w:semiHidden="0" w:unhideWhenUsed="0"/>
-    <w:lsdException w:name="Dark List Accent 3" w:uiPriority="70" w:semiHidden="0" w:unhideWhenUsed="0"/>
-    <w:lsdException w:name="E-mail Signature" w:uiPriority="0" w:semiHidden="0" w:unhideWhenUsed="0"/>
-    <w:lsdException w:name="List Continue 2" w:uiPriority="0" w:semiHidden="0" w:unhideWhenUsed="0"/>
-    <w:lsdException w:name="Normal" w:uiPriority="0" w:semiHidden="0" w:unhideWhenUsed="0" w:qFormat="1"/>
-    <w:lsdException w:name="Medium Grid 1" w:uiPriority="67" w:semiHidden="0" w:unhideWhenUsed="0"/>
-    <w:lsdException w:name="Light List Accent 5" w:uiPriority="61" w:semiHidden="0" w:unhideWhenUsed="0"/>
-    <w:lsdException w:name="Table 3D effects 3" w:uiPriority="0" w:semiHidden="0" w:unhideWhenUsed="0"/>
-    <w:lsdException w:name="List Continue 3" w:uiPriority="0" w:semiHidden="0" w:unhideWhenUsed="0"/>
-    <w:lsdException w:name="Dark List Accent 2" w:uiPriority="70" w:semiHidden="0" w:unhideWhenUsed="0"/>
-    <w:lsdException w:name="index 7" w:uiPriority="0" w:semiHidden="0" w:unhideWhenUsed="0"/>
-    <w:lsdException w:name="Light List Accent 2" w:uiPriority="61" w:semiHidden="0" w:unhideWhenUsed="0"/>
-    <w:lsdException w:name="Medium Shading 1" w:uiPriority="63" w:semiHidden="0" w:unhideWhenUsed="0"/>
-    <w:lsdException w:name="Table List 7" w:uiPriority="0" w:semiHidden="0" w:unhideWhenUsed="0"/>
-    <w:lsdException w:name="Light Shading Accent 2" w:uiPriority="60" w:semiHidden="0" w:unhideWhenUsed="0"/>
-    <w:lsdException w:name="heading 2" w:uiPriority="0" w:qFormat="1"/>
-    <w:lsdException w:name="Medium List 1 Accent 5" w:uiPriority="65" w:semiHidden="0" w:unhideWhenUsed="0"/>
-    <w:lsdException w:name="Medium Grid 1 Accent 1" w:uiPriority="67" w:semiHidden="0" w:unhideWhenUsed="0"/>
-    <w:lsdException w:name="Table Web 3" w:uiPriority="0" w:semiHidden="0" w:unhideWhenUsed="0"/>
-    <w:lsdException w:name="endnote text" w:uiPriority="0" w:semiHidden="0" w:unhideWhenUsed="0"/>
-    <w:lsdException w:name="Medium Grid 2 Accent 4" w:uiPriority="68" w:semiHidden="0" w:unhideWhenUsed="0"/>
-    <w:lsdException w:name="Medium Shading 2" w:uiPriority="64" w:semiHidden="0" w:unhideWhenUsed="0"/>
-    <w:lsdException w:name="Body Text 3" w:uiPriority="0" w:semiHidden="0" w:unhideWhenUsed="0"/>
-    <w:lsdException w:name="Emphasis" w:uiPriority="0" w:semiHidden="0" w:unhideWhenUsed="0" w:qFormat="1"/>
-    <w:lsdException w:name="index 1" w:uiPriority="0" w:semiHidden="0" w:unhideWhenUsed="0"/>
-    <w:lsdException w:name="List Bullet 4" w:uiPriority="0" w:semiHidden="0" w:unhideWhenUsed="0"/>
-    <w:lsdException w:name="Table Contemporary" w:uiPriority="0" w:semiHidden="0" w:unhideWhenUsed="0"/>
-    <w:lsdException w:name="Table Colorful 3" w:uiPriority="0" w:semiHidden="0" w:unhideWhenUsed="0"/>
-    <w:lsdException w:name="Light Grid Accent 1" w:uiPriority="62" w:semiHidden="0" w:unhideWhenUsed="0"/>
-    <w:lsdException w:name="footnote text" w:uiPriority="0" w:semiHidden="0" w:unhideWhenUsed="0"/>
-    <w:lsdException w:name="Medium Shading 2 Accent 4" w:uiPriority="64" w:semiHidden="0" w:unhideWhenUsed="0"/>
-    <w:lsdException w:name="Table List 2" w:uiPriority="0" w:semiHidden="0" w:unhideWhenUsed="0"/>
-    <w:lsdException w:name="Light Grid Accent 2" w:uiPriority="62" w:semiHidden="0" w:unhideWhenUsed="0"/>
-    <w:lsdException w:name="Medium Shading 2 Accent 1" w:uiPriority="64" w:semiHidden="0" w:unhideWhenUsed="0"/>
-    <w:lsdException w:name="Medium Grid 3 Accent 3" w:uiPriority="69" w:semiHidden="0" w:unhideWhenUsed="0"/>
-    <w:lsdException w:name="heading 1" w:uiPriority="0" w:semiHidden="0" w:unhideWhenUsed="0" w:qFormat="1"/>
-    <w:lsdException w:name="HTML Acronym" w:uiPriority="0" w:semiHidden="0" w:unhideWhenUsed="0"/>
-    <w:lsdException w:name="Light List Accent 4" w:uiPriority="61" w:semiHidden="0" w:unhideWhenUsed="0"/>
-    <w:lsdException w:name="Colorful List Accent 4" w:uiPriority="72" w:semiHidden="0" w:unhideWhenUsed="0"/>
-    <w:lsdException w:name="Body Text Indent 2" w:uiPriority="0" w:semiHidden="0" w:unhideWhenUsed="0"/>
-    <w:lsdException w:name="toc 2" w:uiPriority="0" w:semiHidden="0" w:unhideWhenUsed="0"/>
-    <w:lsdException w:name="Medium Grid 3 Accent 6" w:uiPriority="69" w:semiHidden="0" w:unhideWhenUsed="0"/>
-    <w:lsdException w:name="Colorful Grid Accent 6" w:uiPriority="73" w:semiHidden="0" w:unhideWhenUsed="0"/>
-    <w:lsdException w:name="Colorful List Accent 6" w:uiPriority="72" w:semiHidden="0" w:unhideWhenUsed="0"/>
-    <w:lsdException w:name="toc 8" w:uiPriority="0" w:semiHidden="0" w:unhideWhenUsed="0"/>
-    <w:lsdException w:name="Balloon Text" w:uiPriority="0" w:semiHidden="0" w:unhideWhenUsed="0"/>
-    <w:lsdException w:name="Block Text" w:uiPriority="0" w:semiHidden="0" w:unhideWhenUsed="0"/>
-    <w:lsdException w:name="Colorful Shading Accent 6" w:uiPriority="71" w:semiHidden="0" w:unhideWhenUsed="0"/>
-    <w:lsdException w:name="Medium Grid 3 Accent 5" w:uiPriority="69" w:semiHidden="0" w:unhideWhenUsed="0"/>
-    <w:lsdException w:name="Table Simple 1" w:uiPriority="0" w:semiHidden="0" w:unhideWhenUsed="0"/>
-    <w:lsdException w:name="Table Columns 5" w:uiPriority="0" w:semiHidden="0" w:unhideWhenUsed="0"/>
-    <w:lsdException w:name="Light Grid Accent 5" w:uiPriority="62" w:semiHidden="0" w:unhideWhenUsed="0"/>
-    <w:lsdException w:name="List Number 2" w:uiPriority="0" w:semiHidden="0" w:unhideWhenUsed="0"/>
-    <w:lsdException w:name="Title" w:uiPriority="0" w:semiHidden="0" w:unhideWhenUsed="0" w:qFormat="1"/>
-    <w:lsdException w:name="Light List Accent 1" w:uiPriority="61" w:semiHidden="0" w:unhideWhenUsed="0"/>
-    <w:lsdException w:name="Medium Shading 2 Accent 6" w:uiPriority="64" w:semiHidden="0" w:unhideWhenUsed="0"/>
-    <w:lsdException w:name="Body Text First Indent" w:uiPriority="0" w:semiHidden="0" w:unhideWhenUsed="0"/>
-    <w:lsdException w:name="Colorful List Accent 3" w:uiPriority="72" w:semiHidden="0" w:unhideWhenUsed="0"/>
-    <w:lsdException w:name="Colorful Shading Accent 5" w:uiPriority="71" w:semiHidden="0" w:unhideWhenUsed="0"/>
-    <w:lsdException w:name="Table Columns 4" w:uiPriority="0" w:semiHidden="0" w:unhideWhenUsed="0"/>
   </w:latentStyles>
+  <w:style w:type="paragraph" w:styleId="000001" w:default="1">
+    <w:name w:val="Normal"/>
+    <w:uiPriority w:val="0"/>
+    <w:qFormat w:val="1"/>
+    <w:pPr>
+      <w:widowControl w:val="0"/>
+      <w:jc w:val="both"/>
+    </w:pPr>
+    <w:rPr>
+      <w:rFonts w:asciiTheme="minorHAnsi" w:hAnsiTheme="minorHAnsi" w:eastAsiaTheme="minorEastAsia" w:cstheme="minorBidi"/>
+      <w:kern w:val="2"/>
+      <w:sz w:val="21"/>
+      <w:szCs w:val="24"/>
+      <w:lang w:val="en-US" w:eastAsia="zh-CN" w:bidi="ar-SA"/>
+    </w:rPr>
+  </w:style>
   <w:style w:type="character" w:styleId="000002" w:default="1">
     <w:name w:val="Default Paragraph Font"/>
     <w:uiPriority w:val="0"/>
@@ -20928,22 +21369,6 @@
         <w:right w:w="108" w:type="dxa"/>
       </w:tblCellMar>
     </w:tblPr>
-  </w:style>
-  <w:style w:type="paragraph" w:styleId="000001" w:default="1">
-    <w:name w:val="Normal"/>
-    <w:uiPriority w:val="0"/>
-    <w:qFormat w:val="1"/>
-    <w:pPr>
-      <w:widowControl w:val="0"/>
-      <w:jc w:val="both"/>
-    </w:pPr>
-    <w:rPr>
-      <w:rFonts w:asciiTheme="minorHAnsi" w:hAnsiTheme="minorHAnsi" w:eastAsiaTheme="minorEastAsia" w:cstheme="minorBidi"/>
-      <w:kern w:val="2"/>
-      <w:sz w:val="21"/>
-      <w:szCs w:val="24"/>
-      <w:lang w:val="en-US" w:eastAsia="zh-CN" w:bidi="ar-SA"/>
-    </w:rPr>
   </w:style>
 </w:styles>
 </file>

</xml_diff>

<commit_message>
feat: add Abyssal River and Stellar Sea with card document sync
</commit_message>
<xml_diff>
--- a/晶塔世界角色.docx
+++ b/晶塔世界角色.docx
@@ -455,7 +455,7 @@
           <w:szCs w:val="28"/>
           <w:lang w:val="en-US" w:eastAsia="zh-CN"/>
         </w:rPr>
-        <w:t>稀有卡（10/27）</w:t>
+        <w:t>稀有卡（12/27）</w:t>
       </w:r>
     </w:p>
     <w:p>
@@ -496,7 +496,7 @@
           <w:szCs w:val="28"/>
           <w:lang w:val="en-US" w:eastAsia="zh-CN"/>
         </w:rPr>
-        <w:t>攻击（3/8）</w:t>
+        <w:t>攻击（5/8）</w:t>
       </w:r>
     </w:p>
     <w:p>
@@ -18243,7 +18243,7 @@
           <w:szCs w:val="28"/>
           <w:lang w:val="en-US" w:eastAsia="zh-CN"/>
         </w:rPr>
-        <w:t>攻击（3/8）</w:t>
+        <w:t>攻击（5/8）</w:t>
       </w:r>
     </w:p>
     <w:p>
@@ -18822,6 +18822,421 @@
           <w:u w:val="none"/>
         </w:rPr>
       </w:pPr>
+    </w:p>
+    <w:p>
+      <w:pPr>
+        <w:pBdr/>
+        <w:snapToGrid w:val="1"/>
+        <w:spacing w:line="240"/>
+        <w:ind/>
+        <w:rPr>
+          <w:rFonts w:hint="eastAsia"/>
+          <w:b w:val="1"/>
+          <w:bCs w:val="1"/>
+          <w:i w:val="0"/>
+          <w:strike w:val="0"/>
+          <w:color w:val="auto"/>
+          <w:spacing w:val="0"/>
+          <w:sz w:val="18"/>
+          <w:szCs w:val="22"/>
+          <w:u w:val="none"/>
+        </w:rPr>
+      </w:pPr>
+      <w:r>
+        <w:rPr>
+          <w:rFonts w:hint="eastAsia"/>
+          <w:b w:val="1"/>
+          <w:bCs w:val="1"/>
+          <w:i w:val="0"/>
+          <w:strike w:val="0"/>
+          <w:color w:val="auto"/>
+          <w:spacing w:val="0"/>
+          <w:sz w:val="18"/>
+          <w:szCs w:val="22"/>
+          <w:u w:val="none"/>
+        </w:rPr>
+        <w:t>渊河</w:t>
+      </w:r>
+    </w:p>
+    <w:p>
+      <w:pPr>
+        <w:pBdr/>
+        <w:snapToGrid w:val="1"/>
+        <w:spacing w:line="240"/>
+        <w:ind/>
+        <w:rPr>
+          <w:rFonts w:hint="eastAsia"/>
+          <w:b w:val="1"/>
+          <w:bCs w:val="1"/>
+          <w:i w:val="0"/>
+          <w:strike w:val="0"/>
+          <w:color w:val="auto"/>
+          <w:spacing w:val="0"/>
+          <w:sz w:val="18"/>
+          <w:szCs w:val="22"/>
+          <w:u w:val="none"/>
+        </w:rPr>
+      </w:pPr>
+      <w:r>
+        <w:rPr>
+          <w:rFonts w:hint="eastAsia"/>
+          <w:b w:val="1"/>
+          <w:bCs w:val="1"/>
+          <w:i w:val="0"/>
+          <w:strike w:val="0"/>
+          <w:color w:val="000000"/>
+          <w:spacing w:val="0"/>
+          <w:sz w:val="18"/>
+          <w:szCs w:val="22"/>
+          <w:u w:val="none"/>
+        </w:rPr>
+        <w:t>0c 稀有 攻击</w:t>
+      </w:r>
+    </w:p>
+    <w:p>
+      <w:pPr>
+        <w:pBdr/>
+        <w:snapToGrid w:val="1"/>
+        <w:spacing w:line="240"/>
+        <w:ind/>
+        <w:rPr>
+          <w:rFonts w:hint="eastAsia"/>
+          <w:b w:val="1"/>
+          <w:bCs w:val="1"/>
+          <w:i w:val="0"/>
+          <w:strike w:val="0"/>
+          <w:color w:val="auto"/>
+          <w:spacing w:val="0"/>
+          <w:sz w:val="18"/>
+          <w:szCs w:val="22"/>
+          <w:u w:val="none"/>
+        </w:rPr>
+      </w:pPr>
+      <w:r>
+        <w:rPr>
+          <w:rFonts w:hint="eastAsia"/>
+          <w:b w:val="1"/>
+          <w:bCs w:val="1"/>
+          <w:i w:val="0"/>
+          <w:strike w:val="0"/>
+          <w:color w:val="000000"/>
+          <w:spacing w:val="0"/>
+          <w:sz w:val="18"/>
+          <w:szCs w:val="22"/>
+          <w:u w:val="none"/>
+        </w:rPr>
+        <w:t>造成7点伤害。</w:t>
+      </w:r>
+    </w:p>
+    <w:p>
+      <w:pPr>
+        <w:pBdr/>
+        <w:snapToGrid w:val="1"/>
+        <w:spacing w:line="240"/>
+        <w:ind/>
+        <w:rPr>
+          <w:rFonts w:hint="eastAsia"/>
+          <w:b w:val="1"/>
+          <w:bCs w:val="1"/>
+          <w:i w:val="0"/>
+          <w:strike w:val="0"/>
+          <w:color w:val="auto"/>
+          <w:spacing w:val="0"/>
+          <w:sz w:val="18"/>
+          <w:szCs w:val="22"/>
+          <w:u w:val="none"/>
+        </w:rPr>
+      </w:pPr>
+      <w:r>
+        <w:rPr>
+          <w:rFonts w:hint="eastAsia"/>
+          <w:b w:val="1"/>
+          <w:bCs w:val="1"/>
+          <w:i w:val="0"/>
+          <w:strike w:val="0"/>
+          <w:color w:val="000000"/>
+          <w:spacing w:val="0"/>
+          <w:sz w:val="18"/>
+          <w:szCs w:val="22"/>
+          <w:u w:val="none"/>
+        </w:rPr>
+        <w:t>每当你打出晶化时，将此牌返回你的手牌。</w:t>
+      </w:r>
+    </w:p>
+    <w:p>
+      <w:pPr>
+        <w:pBdr/>
+        <w:snapToGrid w:val="1"/>
+        <w:spacing w:line="240"/>
+        <w:ind/>
+        <w:rPr>
+          <w:rFonts w:hint="eastAsia"/>
+          <w:b w:val="1"/>
+          <w:bCs w:val="1"/>
+          <w:i w:val="0"/>
+          <w:strike w:val="0"/>
+          <w:color w:val="auto"/>
+          <w:spacing w:val="0"/>
+          <w:sz w:val="18"/>
+          <w:szCs w:val="22"/>
+          <w:u w:val="none"/>
+        </w:rPr>
+      </w:pPr>
+      <w:r>
+        <w:rPr>
+          <w:rFonts w:hint="eastAsia"/>
+          <w:b w:val="1"/>
+          <w:bCs w:val="1"/>
+          <w:i w:val="0"/>
+          <w:strike w:val="0"/>
+          <w:color w:val="00B050"/>
+          <w:spacing w:val="0"/>
+          <w:sz w:val="18"/>
+          <w:szCs w:val="22"/>
+          <w:u w:val="none"/>
+        </w:rPr>
+        <w:t/>
+      </w:r>
+    </w:p>
+    <w:p>
+      <w:pPr>
+        <w:pBdr/>
+        <w:snapToGrid w:val="1"/>
+        <w:spacing w:line="240"/>
+        <w:ind/>
+        <w:rPr>
+          <w:rFonts w:hint="eastAsia"/>
+          <w:b w:val="1"/>
+          <w:bCs w:val="1"/>
+          <w:i w:val="0"/>
+          <w:strike w:val="0"/>
+          <w:color w:val="auto"/>
+          <w:spacing w:val="0"/>
+          <w:sz w:val="18"/>
+          <w:szCs w:val="22"/>
+          <w:u w:val="none"/>
+        </w:rPr>
+      </w:pPr>
+      <w:r>
+        <w:rPr>
+          <w:rFonts w:hint="eastAsia"/>
+          <w:b w:val="1"/>
+          <w:bCs w:val="1"/>
+          <w:i w:val="0"/>
+          <w:strike w:val="0"/>
+          <w:color w:val="auto"/>
+          <w:spacing w:val="0"/>
+          <w:sz w:val="18"/>
+          <w:szCs w:val="22"/>
+          <w:u w:val="none"/>
+        </w:rPr>
+        <w:t>辰海</w:t>
+      </w:r>
+    </w:p>
+    <w:p>
+      <w:pPr>
+        <w:pBdr/>
+        <w:snapToGrid w:val="1"/>
+        <w:spacing w:line="240"/>
+        <w:ind/>
+        <w:rPr>
+          <w:rFonts w:hint="eastAsia"/>
+          <w:b w:val="1"/>
+          <w:bCs w:val="1"/>
+          <w:i w:val="0"/>
+          <w:strike w:val="0"/>
+          <w:color w:val="auto"/>
+          <w:spacing w:val="0"/>
+          <w:sz w:val="18"/>
+          <w:szCs w:val="22"/>
+          <w:u w:val="none"/>
+        </w:rPr>
+      </w:pPr>
+      <w:r>
+        <w:rPr>
+          <w:rFonts w:hint="eastAsia"/>
+          <w:b w:val="1"/>
+          <w:bCs w:val="1"/>
+          <w:i w:val="0"/>
+          <w:strike w:val="0"/>
+          <w:color w:val="000000"/>
+          <w:spacing w:val="0"/>
+          <w:sz w:val="18"/>
+          <w:szCs w:val="22"/>
+          <w:u w:val="none"/>
+        </w:rPr>
+        <w:t>1c 稀有 攻击</w:t>
+      </w:r>
+    </w:p>
+    <w:p>
+      <w:pPr>
+        <w:pBdr/>
+        <w:snapToGrid w:val="1"/>
+        <w:spacing w:line="240"/>
+        <w:ind/>
+        <w:rPr>
+          <w:rFonts w:hint="eastAsia"/>
+          <w:b w:val="1"/>
+          <w:bCs w:val="1"/>
+          <w:i w:val="0"/>
+          <w:strike w:val="0"/>
+          <w:color w:val="auto"/>
+          <w:spacing w:val="0"/>
+          <w:sz w:val="18"/>
+          <w:szCs w:val="22"/>
+          <w:u w:val="none"/>
+        </w:rPr>
+      </w:pPr>
+      <w:r>
+        <w:rPr>
+          <w:rFonts w:hint="eastAsia"/>
+          <w:b w:val="1"/>
+          <w:bCs w:val="1"/>
+          <w:i w:val="0"/>
+          <w:strike w:val="0"/>
+          <w:color w:val="000000"/>
+          <w:spacing w:val="0"/>
+          <w:sz w:val="18"/>
+          <w:szCs w:val="22"/>
+          <w:u w:val="none"/>
+        </w:rPr>
+        <w:t>造成10（</w:t>
+      </w:r>
+      <w:r>
+        <w:rPr>
+          <w:rFonts w:hint="eastAsia"/>
+          <w:b w:val="1"/>
+          <w:bCs w:val="1"/>
+          <w:i w:val="0"/>
+          <w:strike w:val="0"/>
+          <w:color w:val="00B050"/>
+          <w:spacing w:val="0"/>
+          <w:sz w:val="18"/>
+          <w:szCs w:val="22"/>
+          <w:u w:val="none"/>
+        </w:rPr>
+        <w:t>+2</w:t>
+      </w:r>
+      <w:r>
+        <w:rPr>
+          <w:rFonts w:hint="eastAsia"/>
+          <w:b w:val="1"/>
+          <w:bCs w:val="1"/>
+          <w:i w:val="0"/>
+          <w:strike w:val="0"/>
+          <w:color w:val="000000"/>
+          <w:spacing w:val="0"/>
+          <w:sz w:val="18"/>
+          <w:szCs w:val="22"/>
+          <w:u w:val="none"/>
+        </w:rPr>
+        <w:t>）点伤害。</w:t>
+      </w:r>
+    </w:p>
+    <w:p>
+      <w:pPr>
+        <w:pBdr/>
+        <w:snapToGrid w:val="1"/>
+        <w:spacing w:line="240"/>
+        <w:ind/>
+        <w:rPr>
+          <w:rFonts w:hint="eastAsia"/>
+          <w:b w:val="1"/>
+          <w:bCs w:val="1"/>
+          <w:i w:val="0"/>
+          <w:strike w:val="0"/>
+          <w:color w:val="auto"/>
+          <w:spacing w:val="0"/>
+          <w:sz w:val="18"/>
+          <w:szCs w:val="22"/>
+          <w:u w:val="none"/>
+        </w:rPr>
+      </w:pPr>
+      <w:r>
+        <w:rPr>
+          <w:rFonts w:hint="eastAsia"/>
+          <w:b w:val="1"/>
+          <w:bCs w:val="1"/>
+          <w:i w:val="0"/>
+          <w:strike w:val="0"/>
+          <w:color w:val="000000"/>
+          <w:spacing w:val="0"/>
+          <w:sz w:val="18"/>
+          <w:szCs w:val="22"/>
+          <w:u w:val="none"/>
+        </w:rPr>
+        <w:t>可以无限升级。</w:t>
+      </w:r>
+    </w:p>
+    <w:p>
+      <w:pPr>
+        <w:pBdr/>
+        <w:snapToGrid w:val="1"/>
+        <w:spacing w:line="240"/>
+        <w:ind/>
+        <w:rPr>
+          <w:rFonts w:hint="eastAsia"/>
+          <w:b w:val="1"/>
+          <w:bCs w:val="1"/>
+          <w:i w:val="0"/>
+          <w:strike w:val="0"/>
+          <w:color w:val="auto"/>
+          <w:spacing w:val="0"/>
+          <w:sz w:val="18"/>
+          <w:szCs w:val="22"/>
+          <w:u w:val="none"/>
+        </w:rPr>
+      </w:pPr>
+      <w:r>
+        <w:rPr>
+          <w:rFonts w:hint="eastAsia"/>
+          <w:b w:val="1"/>
+          <w:bCs w:val="1"/>
+          <w:i w:val="0"/>
+          <w:strike w:val="0"/>
+          <w:color w:val="000000"/>
+          <w:spacing w:val="0"/>
+          <w:sz w:val="18"/>
+          <w:szCs w:val="22"/>
+          <w:u w:val="none"/>
+        </w:rPr>
+        <w:t>每场战斗结束时，若此牌打出次数大于其当前升级次数，升级此牌。</w:t>
+      </w:r>
+    </w:p>
+    <w:p>
+      <w:pPr>
+        <w:pBdr/>
+        <w:snapToGrid w:val="1"/>
+        <w:spacing w:line="240"/>
+        <w:ind/>
+        <w:rPr>
+          <w:rFonts w:hint="eastAsia"/>
+          <w:b w:val="1"/>
+          <w:bCs w:val="1"/>
+          <w:i w:val="0"/>
+          <w:strike w:val="0"/>
+          <w:color w:val="auto"/>
+          <w:spacing w:val="0"/>
+          <w:sz w:val="18"/>
+          <w:szCs w:val="22"/>
+          <w:u w:val="none"/>
+        </w:rPr>
+      </w:pPr>
+      <w:r>
+        <w:rPr>
+          <w:rFonts w:hint="eastAsia"/>
+          <w:b w:val="1"/>
+          <w:bCs w:val="1"/>
+          <w:i w:val="0"/>
+          <w:strike w:val="0"/>
+          <w:color w:val="00B050"/>
+          <w:spacing w:val="0"/>
+          <w:sz w:val="18"/>
+          <w:szCs w:val="22"/>
+          <w:u w:val="none"/>
+        </w:rPr>
+        <w:t/>
+      </w:r>
     </w:p>
     <w:p>
       <w:pPr>

</xml_diff>